<commit_message>
revisions state on April 3-4 (still draft -> to be revised Sunday night and sent Monday
</commit_message>
<xml_diff>
--- a/Final_phase_Article/Writing/Revisions_april_13/Cover_letter_point_by_point_combined.docx
+++ b/Final_phase_Article/Writing/Revisions_april_13/Cover_letter_point_by_point_combined.docx
@@ -1379,16 +1379,7 @@
           <w:iCs/>
           <w:color w:val="0F4761" w:themeColor="accent1" w:themeShade="BF"/>
         </w:rPr>
-        <w:t xml:space="preserve">: We </w:t>
-      </w:r>
-      <w:r>
-        <w:rPr>
-          <w:rFonts w:ascii="Arial" w:hAnsi="Arial" w:cs="Arial"/>
-          <w:i/>
-          <w:iCs/>
-          <w:color w:val="0F4761" w:themeColor="accent1" w:themeShade="BF"/>
-        </w:rPr>
-        <w:t>thank the reviewer for these valuable suggestions, which we incorporated in the revised mini</w:t>
+        <w:t>: We thank the reviewer for these valuable suggestions, which we incorporated in the revised mini</w:t>
       </w:r>
       <w:r>
         <w:rPr>
@@ -1530,6 +1521,154 @@
           <w:color w:val="000000" w:themeColor="text1"/>
           <w:highlight w:val="yellow"/>
         </w:rPr>
+        <w:t xml:space="preserve"> an improvement in planning and design to better</w:t>
+      </w:r>
+      <w:r>
+        <w:rPr>
+          <w:rFonts w:cs="Calibri"/>
+          <w:b/>
+          <w:bCs/>
+          <w:i/>
+          <w:iCs/>
+          <w:color w:val="000000" w:themeColor="text1"/>
+        </w:rPr>
+        <w:t xml:space="preserve"> </w:t>
+      </w:r>
+      <w:r>
+        <w:rPr>
+          <w:rFonts w:cs="Calibri"/>
+          <w:color w:val="000000" w:themeColor="text1"/>
+        </w:rPr>
+        <w:t xml:space="preserve">inform </w:t>
+      </w:r>
+      <w:r>
+        <w:rPr>
+          <w:rFonts w:cs="Calibri"/>
+          <w:color w:val="000000" w:themeColor="text1"/>
+        </w:rPr>
+        <w:t>patient</w:t>
+      </w:r>
+      <w:r>
+        <w:rPr>
+          <w:rFonts w:cs="Calibri"/>
+          <w:color w:val="000000" w:themeColor="text1"/>
+        </w:rPr>
+        <w:t>-</w:t>
+      </w:r>
+      <w:r>
+        <w:rPr>
+          <w:rFonts w:cs="Calibri"/>
+          <w:color w:val="000000" w:themeColor="text1"/>
+        </w:rPr>
+        <w:t xml:space="preserve">relevant </w:t>
+      </w:r>
+      <w:r>
+        <w:rPr>
+          <w:rFonts w:cs="Calibri"/>
+          <w:color w:val="000000" w:themeColor="text1"/>
+        </w:rPr>
+        <w:t>clinical decision-making.</w:t>
+      </w:r>
+      <w:r>
+        <w:rPr>
+          <w:rFonts w:cs="Calibri"/>
+          <w:color w:val="000000" w:themeColor="text1"/>
+        </w:rPr>
+        <w:t xml:space="preserve"> </w:t>
+      </w:r>
+      <w:r>
+        <w:rPr>
+          <w:rFonts w:cs="Calibri"/>
+          <w:color w:val="000000" w:themeColor="text1"/>
+        </w:rPr>
+        <w:t xml:space="preserve"> </w:t>
+      </w:r>
+    </w:p>
+    <w:p>
+      <w:pPr>
+        <w:rPr>
+          <w:rFonts w:ascii="Arial" w:hAnsi="Arial" w:cs="Arial"/>
+          <w:i/>
+          <w:iCs/>
+          <w:color w:val="0F4761" w:themeColor="accent1" w:themeShade="BF"/>
+        </w:rPr>
+      </w:pPr>
+    </w:p>
+    <w:p>
+      <w:pPr>
+        <w:rPr>
+          <w:rFonts w:ascii="Arial" w:hAnsi="Arial" w:cs="Arial"/>
+          <w:i/>
+          <w:iCs/>
+          <w:color w:val="0F4761" w:themeColor="accent1" w:themeShade="BF"/>
+        </w:rPr>
+      </w:pPr>
+      <w:r>
+        <w:rPr>
+          <w:i/>
+          <w:iCs/>
+          <w:color w:val="0F4761" w:themeColor="accent1" w:themeShade="BF"/>
+        </w:rPr>
+        <w:t>Extracted from</w:t>
+      </w:r>
+      <w:r>
+        <w:rPr>
+          <w:rFonts w:ascii="Arial" w:hAnsi="Arial" w:cs="Arial"/>
+          <w:i/>
+          <w:iCs/>
+          <w:color w:val="0F4761" w:themeColor="accent1" w:themeShade="BF"/>
+        </w:rPr>
+        <w:t xml:space="preserve"> </w:t>
+      </w:r>
+      <w:r>
+        <w:rPr>
+          <w:rFonts w:ascii="Arial" w:hAnsi="Arial" w:cs="Arial"/>
+          <w:b/>
+          <w:bCs/>
+          <w:i/>
+          <w:iCs/>
+          <w:color w:val="0F4761" w:themeColor="accent1" w:themeShade="BF"/>
+        </w:rPr>
+        <w:t>Abstract</w:t>
+      </w:r>
+      <w:r>
+        <w:rPr>
+          <w:rFonts w:ascii="Arial" w:hAnsi="Arial" w:cs="Arial"/>
+          <w:i/>
+          <w:iCs/>
+          <w:color w:val="0F4761" w:themeColor="accent1" w:themeShade="BF"/>
+        </w:rPr>
+        <w:t>:</w:t>
+      </w:r>
+    </w:p>
+    <w:p>
+      <w:pPr>
+        <w:spacing w:after="0" w:line="480" w:lineRule="auto"/>
+        <w:rPr>
+          <w:rFonts w:cs="Calibri"/>
+          <w:b/>
+          <w:bCs/>
+          <w:i/>
+          <w:iCs/>
+          <w:color w:val="000000" w:themeColor="text1"/>
+        </w:rPr>
+      </w:pPr>
+      <w:r>
+        <w:rPr>
+          <w:b/>
+          <w:bCs/>
+        </w:rPr>
+        <w:t>Conclusion:</w:t>
+      </w:r>
+      <w:r>
+        <w:rPr>
+          <w:rFonts w:cs="Calibri"/>
+          <w:b/>
+          <w:bCs/>
+          <w:i/>
+          <w:iCs/>
+          <w:color w:val="000000" w:themeColor="text1"/>
+        </w:rPr>
         <w:t xml:space="preserve"> </w:t>
       </w:r>
       <w:r>
@@ -1542,139 +1681,427 @@
           <w:color w:val="000000" w:themeColor="text1"/>
           <w:highlight w:val="yellow"/>
         </w:rPr>
-        <w:t>an improvement in</w:t>
-      </w:r>
-      <w:r>
-        <w:rPr>
-          <w:rFonts w:cs="Calibri"/>
-          <w:b/>
-          <w:bCs/>
-          <w:i/>
-          <w:iCs/>
-          <w:color w:val="000000" w:themeColor="text1"/>
-          <w:highlight w:val="yellow"/>
+        <w:t>Our results suggest concerns in the ability of surgical RCTs to inform clinical decision-making.</w:t>
+      </w:r>
+    </w:p>
+    <w:p/>
+    <w:p>
+      <w:pPr>
+        <w:rPr>
+          <w:rFonts w:ascii="Arial" w:hAnsi="Arial" w:cs="Arial"/>
+        </w:rPr>
+      </w:pPr>
+      <w:r>
+        <w:rPr>
+          <w:rFonts w:ascii="Arial" w:hAnsi="Arial" w:cs="Arial"/>
+        </w:rPr>
+        <w:t>- the composite definition of meaningfully informing clinical practice is crucial to this manuscript. And as mentioned also one of its strengths. The definition would benefit from a clear description how MID are defined. How should these be formed: Delphi methods for treating physicians and focus groups for patients ? This is the crux for future designs. These outcomes need to be properly defined and validated. Please comment and comment on in discussion.</w:t>
+      </w:r>
+    </w:p>
+    <w:p>
+      <w:pPr>
+        <w:rPr>
+          <w:rFonts w:ascii="Arial" w:hAnsi="Arial" w:cs="Arial"/>
+        </w:rPr>
+      </w:pPr>
+    </w:p>
+    <w:p>
+      <w:pPr>
+        <w:rPr>
+          <w:rFonts w:ascii="Arial" w:hAnsi="Arial" w:cs="Arial"/>
+          <w:i/>
+          <w:iCs/>
+          <w:color w:val="0F4761" w:themeColor="accent1" w:themeShade="BF"/>
+        </w:rPr>
+      </w:pPr>
+      <w:r>
+        <w:rPr>
+          <w:rFonts w:ascii="Arial" w:hAnsi="Arial" w:cs="Arial"/>
+          <w:i/>
+          <w:iCs/>
+          <w:color w:val="0F4761" w:themeColor="accent1" w:themeShade="BF"/>
+          <w:u w:val="single"/>
+        </w:rPr>
+        <w:t>Answer</w:t>
+      </w:r>
+      <w:r>
+        <w:rPr>
+          <w:rFonts w:ascii="Arial" w:hAnsi="Arial" w:cs="Arial"/>
+          <w:i/>
+          <w:iCs/>
+          <w:color w:val="0F4761" w:themeColor="accent1" w:themeShade="BF"/>
+        </w:rPr>
+        <w:t xml:space="preserve">: We thank the reviewer for </w:t>
+      </w:r>
+      <w:r>
+        <w:rPr>
+          <w:rFonts w:ascii="Arial" w:hAnsi="Arial" w:cs="Arial"/>
+          <w:i/>
+          <w:iCs/>
+          <w:color w:val="0F4761" w:themeColor="accent1" w:themeShade="BF"/>
+        </w:rPr>
+        <w:t>highlighting</w:t>
+      </w:r>
+      <w:r>
+        <w:rPr>
+          <w:rFonts w:ascii="Arial" w:hAnsi="Arial" w:cs="Arial"/>
+          <w:i/>
+          <w:iCs/>
+          <w:color w:val="0F4761" w:themeColor="accent1" w:themeShade="BF"/>
         </w:rPr>
         <w:t xml:space="preserve"> </w:t>
       </w:r>
       <w:r>
         <w:rPr>
-          <w:rFonts w:cs="Calibri"/>
-          <w:b/>
-          <w:bCs/>
-          <w:i/>
-          <w:iCs/>
-          <w:color w:val="000000" w:themeColor="text1"/>
-          <w:highlight w:val="yellow"/>
-        </w:rPr>
-        <w:t>planning and design to better</w:t>
-      </w:r>
-      <w:r>
-        <w:rPr>
-          <w:rFonts w:cs="Calibri"/>
-          <w:b/>
-          <w:bCs/>
-          <w:i/>
-          <w:iCs/>
-          <w:color w:val="000000" w:themeColor="text1"/>
+          <w:rFonts w:ascii="Arial" w:hAnsi="Arial" w:cs="Arial"/>
+          <w:i/>
+          <w:iCs/>
+          <w:color w:val="0F4761" w:themeColor="accent1" w:themeShade="BF"/>
+        </w:rPr>
+        <w:t xml:space="preserve">the strength of </w:t>
+      </w:r>
+      <w:r>
+        <w:rPr>
+          <w:rFonts w:ascii="Arial" w:hAnsi="Arial" w:cs="Arial"/>
+          <w:i/>
+          <w:iCs/>
+          <w:color w:val="0F4761" w:themeColor="accent1" w:themeShade="BF"/>
+        </w:rPr>
+        <w:t xml:space="preserve">our </w:t>
+      </w:r>
+      <w:r>
+        <w:rPr>
+          <w:rFonts w:ascii="Arial" w:hAnsi="Arial" w:cs="Arial"/>
+          <w:i/>
+          <w:iCs/>
+          <w:color w:val="0F4761" w:themeColor="accent1" w:themeShade="BF"/>
+        </w:rPr>
+        <w:t xml:space="preserve">original definition. As its understanding is dependent on the MID concept, we added in </w:t>
+      </w:r>
+      <w:r>
+        <w:rPr>
+          <w:rFonts w:ascii="Arial" w:hAnsi="Arial" w:cs="Arial"/>
+          <w:b/>
+          <w:bCs/>
+          <w:i/>
+          <w:iCs/>
+          <w:color w:val="0F4761" w:themeColor="accent1" w:themeShade="BF"/>
+        </w:rPr>
+        <w:t>Methods</w:t>
+      </w:r>
+      <w:r>
+        <w:rPr>
+          <w:rFonts w:ascii="Arial" w:hAnsi="Arial" w:cs="Arial"/>
+          <w:i/>
+          <w:iCs/>
+          <w:color w:val="0F4761" w:themeColor="accent1" w:themeShade="BF"/>
+        </w:rPr>
+        <w:t xml:space="preserve"> section a</w:t>
+      </w:r>
+      <w:r>
+        <w:rPr>
+          <w:rFonts w:ascii="Arial" w:hAnsi="Arial" w:cs="Arial"/>
+          <w:i/>
+          <w:iCs/>
+          <w:color w:val="0F4761" w:themeColor="accent1" w:themeShade="BF"/>
+        </w:rPr>
+        <w:t xml:space="preserve"> subsection </w:t>
+      </w:r>
+      <w:r>
+        <w:rPr>
+          <w:rFonts w:ascii="Arial" w:hAnsi="Arial" w:cs="Arial"/>
+          <w:b/>
+          <w:bCs/>
+          <w:i/>
+          <w:iCs/>
+          <w:color w:val="0F4761" w:themeColor="accent1" w:themeShade="BF"/>
+        </w:rPr>
+        <w:t>Outcomes definition</w:t>
+      </w:r>
+      <w:r>
+        <w:rPr>
+          <w:rFonts w:ascii="Arial" w:hAnsi="Arial" w:cs="Arial"/>
+          <w:i/>
+          <w:iCs/>
+          <w:color w:val="0F4761" w:themeColor="accent1" w:themeShade="BF"/>
+        </w:rPr>
+        <w:t xml:space="preserve"> with four distinct paragraphs. Each</w:t>
+      </w:r>
+      <w:r>
+        <w:rPr>
+          <w:rFonts w:ascii="Arial" w:hAnsi="Arial" w:cs="Arial"/>
+          <w:i/>
+          <w:iCs/>
+          <w:color w:val="0F4761" w:themeColor="accent1" w:themeShade="BF"/>
         </w:rPr>
         <w:t xml:space="preserve"> </w:t>
       </w:r>
       <w:r>
         <w:rPr>
-          <w:rFonts w:cs="Calibri"/>
-          <w:color w:val="000000" w:themeColor="text1"/>
-        </w:rPr>
-        <w:t xml:space="preserve">inform </w:t>
-      </w:r>
-      <w:r>
-        <w:rPr>
-          <w:rFonts w:cs="Calibri"/>
-          <w:color w:val="000000" w:themeColor="text1"/>
-        </w:rPr>
-        <w:t>patient</w:t>
-      </w:r>
-      <w:r>
-        <w:rPr>
-          <w:rFonts w:cs="Calibri"/>
-          <w:color w:val="000000" w:themeColor="text1"/>
-        </w:rPr>
-        <w:t>-</w:t>
-      </w:r>
-      <w:r>
-        <w:rPr>
-          <w:rFonts w:cs="Calibri"/>
-          <w:color w:val="000000" w:themeColor="text1"/>
-        </w:rPr>
-        <w:t xml:space="preserve">relevant </w:t>
-      </w:r>
-      <w:r>
-        <w:rPr>
-          <w:rFonts w:cs="Calibri"/>
-          <w:color w:val="000000" w:themeColor="text1"/>
-        </w:rPr>
-        <w:t>clinical decision-making.</w:t>
-      </w:r>
-      <w:r>
-        <w:rPr>
-          <w:rFonts w:cs="Calibri"/>
-          <w:color w:val="000000" w:themeColor="text1"/>
+          <w:rFonts w:ascii="Arial" w:hAnsi="Arial" w:cs="Arial"/>
+          <w:i/>
+          <w:iCs/>
+          <w:color w:val="0F4761" w:themeColor="accent1" w:themeShade="BF"/>
+        </w:rPr>
+        <w:t>paragraph defin</w:t>
+      </w:r>
+      <w:r>
+        <w:rPr>
+          <w:rFonts w:ascii="Arial" w:hAnsi="Arial" w:cs="Arial"/>
+          <w:i/>
+          <w:iCs/>
+          <w:color w:val="0F4761" w:themeColor="accent1" w:themeShade="BF"/>
+        </w:rPr>
+        <w:t>es now</w:t>
+      </w:r>
+      <w:r>
+        <w:rPr>
+          <w:rFonts w:ascii="Arial" w:hAnsi="Arial" w:cs="Arial"/>
+          <w:i/>
+          <w:iCs/>
+          <w:color w:val="0F4761" w:themeColor="accent1" w:themeShade="BF"/>
+        </w:rPr>
+        <w:t xml:space="preserve"> each </w:t>
+      </w:r>
+      <w:r>
+        <w:rPr>
+          <w:rFonts w:ascii="Arial" w:hAnsi="Arial" w:cs="Arial"/>
+          <w:i/>
+          <w:iCs/>
+          <w:color w:val="0F4761" w:themeColor="accent1" w:themeShade="BF"/>
+        </w:rPr>
+        <w:t>criterium</w:t>
+      </w:r>
+      <w:r>
+        <w:rPr>
+          <w:rFonts w:ascii="Arial" w:hAnsi="Arial" w:cs="Arial"/>
+          <w:i/>
+          <w:iCs/>
+          <w:color w:val="0F4761" w:themeColor="accent1" w:themeShade="BF"/>
+        </w:rPr>
+        <w:t xml:space="preserve"> of our </w:t>
+      </w:r>
+      <w:r>
+        <w:rPr>
+          <w:rFonts w:ascii="Arial" w:hAnsi="Arial" w:cs="Arial"/>
+          <w:i/>
+          <w:iCs/>
+          <w:color w:val="0F4761" w:themeColor="accent1" w:themeShade="BF"/>
+        </w:rPr>
+        <w:t xml:space="preserve">four-point </w:t>
+      </w:r>
+      <w:r>
+        <w:rPr>
+          <w:rFonts w:ascii="Arial" w:hAnsi="Arial" w:cs="Arial"/>
+          <w:i/>
+          <w:iCs/>
+          <w:color w:val="0F4761" w:themeColor="accent1" w:themeShade="BF"/>
+        </w:rPr>
+        <w:t xml:space="preserve">composite outcome and </w:t>
+      </w:r>
+      <w:r>
+        <w:rPr>
+          <w:rFonts w:ascii="Arial" w:hAnsi="Arial" w:cs="Arial"/>
+          <w:i/>
+          <w:iCs/>
+          <w:color w:val="0F4761" w:themeColor="accent1" w:themeShade="BF"/>
+        </w:rPr>
+        <w:t xml:space="preserve">we </w:t>
+      </w:r>
+      <w:r>
+        <w:rPr>
+          <w:rFonts w:ascii="Arial" w:hAnsi="Arial" w:cs="Arial"/>
+          <w:i/>
+          <w:iCs/>
+          <w:color w:val="0F4761" w:themeColor="accent1" w:themeShade="BF"/>
+        </w:rPr>
+        <w:t xml:space="preserve">define the MID in the paragraph </w:t>
+      </w:r>
+      <w:r>
+        <w:rPr>
+          <w:rFonts w:ascii="Arial" w:hAnsi="Arial" w:cs="Arial"/>
+          <w:b/>
+          <w:bCs/>
+          <w:i/>
+          <w:iCs/>
+          <w:color w:val="0F4761" w:themeColor="accent1" w:themeShade="BF"/>
+        </w:rPr>
+        <w:t>Sample size based on a clinically relevant effect</w:t>
+      </w:r>
+      <w:r>
+        <w:rPr>
+          <w:rFonts w:ascii="Arial" w:hAnsi="Arial" w:cs="Arial"/>
+          <w:i/>
+          <w:iCs/>
+          <w:color w:val="0F4761" w:themeColor="accent1" w:themeShade="BF"/>
+        </w:rPr>
+        <w:t xml:space="preserve">. We also ensured that we did not repeat these elements in the </w:t>
+      </w:r>
+      <w:r>
+        <w:rPr>
+          <w:rFonts w:ascii="Arial" w:hAnsi="Arial" w:cs="Arial"/>
+          <w:b/>
+          <w:bCs/>
+          <w:i/>
+          <w:iCs/>
+          <w:color w:val="0F4761" w:themeColor="accent1" w:themeShade="BF"/>
+        </w:rPr>
+        <w:t>Discussion</w:t>
+      </w:r>
+      <w:r>
+        <w:rPr>
+          <w:rFonts w:ascii="Arial" w:hAnsi="Arial" w:cs="Arial"/>
+          <w:i/>
+          <w:iCs/>
+          <w:color w:val="0F4761" w:themeColor="accent1" w:themeShade="BF"/>
+        </w:rPr>
+        <w:t xml:space="preserve"> section, as we had already dedicated a paragraph to the MID</w:t>
+      </w:r>
+      <w:r>
+        <w:rPr>
+          <w:rFonts w:ascii="Arial" w:hAnsi="Arial" w:cs="Arial"/>
+          <w:i/>
+          <w:iCs/>
+          <w:color w:val="0F4761" w:themeColor="accent1" w:themeShade="BF"/>
+        </w:rPr>
+        <w:t>.</w:t>
+      </w:r>
+    </w:p>
+    <w:p>
+      <w:pPr>
+        <w:rPr>
+          <w:rFonts w:ascii="Arial" w:hAnsi="Arial" w:cs="Arial"/>
+          <w:i/>
+          <w:iCs/>
+          <w:color w:val="0F4761" w:themeColor="accent1" w:themeShade="BF"/>
+        </w:rPr>
+      </w:pPr>
+    </w:p>
+    <w:p>
+      <w:pPr>
+        <w:rPr>
+          <w:rFonts w:ascii="Arial" w:hAnsi="Arial" w:cs="Arial"/>
+          <w:i/>
+          <w:iCs/>
+          <w:color w:val="0F4761" w:themeColor="accent1" w:themeShade="BF"/>
+        </w:rPr>
+      </w:pPr>
+      <w:r>
+        <w:rPr>
+          <w:i/>
+          <w:iCs/>
+          <w:color w:val="0F4761" w:themeColor="accent1" w:themeShade="BF"/>
+        </w:rPr>
+        <w:t>Extracted from</w:t>
+      </w:r>
+      <w:r>
+        <w:rPr>
+          <w:rFonts w:ascii="Arial" w:hAnsi="Arial" w:cs="Arial"/>
+          <w:i/>
+          <w:iCs/>
+          <w:color w:val="0F4761" w:themeColor="accent1" w:themeShade="BF"/>
         </w:rPr>
         <w:t xml:space="preserve"> </w:t>
       </w:r>
       <w:r>
         <w:rPr>
-          <w:rFonts w:cs="Calibri"/>
-          <w:color w:val="000000" w:themeColor="text1"/>
+          <w:rFonts w:ascii="Arial" w:hAnsi="Arial" w:cs="Arial"/>
+          <w:b/>
+          <w:bCs/>
+          <w:i/>
+          <w:iCs/>
+          <w:color w:val="0F4761" w:themeColor="accent1" w:themeShade="BF"/>
+        </w:rPr>
+        <w:t>Methods</w:t>
+      </w:r>
+      <w:r>
+        <w:rPr>
+          <w:rFonts w:ascii="Arial" w:hAnsi="Arial" w:cs="Arial"/>
+          <w:b/>
+          <w:bCs/>
+          <w:i/>
+          <w:iCs/>
+          <w:color w:val="0F4761" w:themeColor="accent1" w:themeShade="BF"/>
+        </w:rPr>
+        <w:t xml:space="preserve"> (page)</w:t>
+      </w:r>
+      <w:r>
+        <w:rPr>
+          <w:rFonts w:ascii="Arial" w:hAnsi="Arial" w:cs="Arial"/>
+          <w:i/>
+          <w:iCs/>
+          <w:color w:val="0F4761" w:themeColor="accent1" w:themeShade="BF"/>
+        </w:rPr>
+        <w:t>:</w:t>
+      </w:r>
+    </w:p>
+    <w:p>
+      <w:pPr>
+        <w:rPr>
+          <w:rFonts w:ascii="Arial" w:hAnsi="Arial" w:cs="Arial"/>
+          <w:i/>
+          <w:iCs/>
+          <w:color w:val="0F4761" w:themeColor="accent1" w:themeShade="BF"/>
+        </w:rPr>
+      </w:pPr>
+    </w:p>
+    <w:p>
+      <w:pPr>
+        <w:rPr>
+          <w:rFonts w:ascii="Arial" w:hAnsi="Arial" w:cs="Arial"/>
+          <w:i/>
+          <w:iCs/>
+          <w:color w:val="0F4761" w:themeColor="accent1" w:themeShade="BF"/>
+        </w:rPr>
+      </w:pPr>
+    </w:p>
+    <w:p>
+      <w:pPr>
+        <w:rPr>
+          <w:rFonts w:ascii="Arial" w:hAnsi="Arial" w:cs="Arial"/>
+          <w:i/>
+          <w:iCs/>
+          <w:color w:val="0F4761" w:themeColor="accent1" w:themeShade="BF"/>
+        </w:rPr>
+      </w:pPr>
+      <w:r>
+        <w:rPr>
+          <w:i/>
+          <w:iCs/>
+          <w:color w:val="0F4761" w:themeColor="accent1" w:themeShade="BF"/>
+        </w:rPr>
+        <w:t>Extracted from</w:t>
+      </w:r>
+      <w:r>
+        <w:rPr>
+          <w:rFonts w:ascii="Arial" w:hAnsi="Arial" w:cs="Arial"/>
+          <w:i/>
+          <w:iCs/>
+          <w:color w:val="0F4761" w:themeColor="accent1" w:themeShade="BF"/>
         </w:rPr>
         <w:t xml:space="preserve"> </w:t>
       </w:r>
-    </w:p>
-    <w:p>
-      <w:pPr>
-        <w:rPr>
-          <w:rFonts w:ascii="Arial" w:hAnsi="Arial" w:cs="Arial"/>
-          <w:i/>
-          <w:iCs/>
-          <w:color w:val="0F4761" w:themeColor="accent1" w:themeShade="BF"/>
-        </w:rPr>
-      </w:pPr>
-    </w:p>
-    <w:p>
-      <w:pPr>
-        <w:rPr>
-          <w:rFonts w:ascii="Arial" w:hAnsi="Arial" w:cs="Arial"/>
-          <w:i/>
-          <w:iCs/>
-          <w:color w:val="0F4761" w:themeColor="accent1" w:themeShade="BF"/>
-        </w:rPr>
-      </w:pPr>
-      <w:r>
-        <w:rPr>
-          <w:i/>
-          <w:iCs/>
-          <w:color w:val="0F4761" w:themeColor="accent1" w:themeShade="BF"/>
-        </w:rPr>
-        <w:t>Extracted from</w:t>
-      </w:r>
-      <w:r>
-        <w:rPr>
-          <w:rFonts w:ascii="Arial" w:hAnsi="Arial" w:cs="Arial"/>
-          <w:i/>
-          <w:iCs/>
-          <w:color w:val="0F4761" w:themeColor="accent1" w:themeShade="BF"/>
-        </w:rPr>
-        <w:t xml:space="preserve"> </w:t>
-      </w:r>
-      <w:r>
-        <w:rPr>
-          <w:rFonts w:ascii="Arial" w:hAnsi="Arial" w:cs="Arial"/>
-          <w:b/>
-          <w:bCs/>
-          <w:i/>
-          <w:iCs/>
-          <w:color w:val="0F4761" w:themeColor="accent1" w:themeShade="BF"/>
-        </w:rPr>
-        <w:t>Abstract</w:t>
+      <w:r>
+        <w:rPr>
+          <w:rFonts w:ascii="Arial" w:hAnsi="Arial" w:cs="Arial"/>
+          <w:b/>
+          <w:bCs/>
+          <w:i/>
+          <w:iCs/>
+          <w:color w:val="0F4761" w:themeColor="accent1" w:themeShade="BF"/>
+        </w:rPr>
+        <w:t>Discussion</w:t>
+      </w:r>
+      <w:r>
+        <w:rPr>
+          <w:rFonts w:ascii="Arial" w:hAnsi="Arial" w:cs="Arial"/>
+          <w:b/>
+          <w:bCs/>
+          <w:i/>
+          <w:iCs/>
+          <w:color w:val="0F4761" w:themeColor="accent1" w:themeShade="BF"/>
+        </w:rPr>
+        <w:t xml:space="preserve"> (page)</w:t>
       </w:r>
       <w:r>
         <w:rPr>
@@ -1688,59 +2115,48 @@
     </w:p>
     <w:p>
       <w:pPr>
-        <w:spacing w:after="0" w:line="480" w:lineRule="auto"/>
-        <w:rPr>
-          <w:rFonts w:cs="Calibri"/>
-          <w:b/>
-          <w:bCs/>
-          <w:i/>
-          <w:iCs/>
-          <w:color w:val="000000" w:themeColor="text1"/>
-        </w:rPr>
-      </w:pPr>
-      <w:r>
-        <w:rPr>
-          <w:b/>
-          <w:bCs/>
-        </w:rPr>
-        <w:t>Conclusion:</w:t>
-      </w:r>
-      <w:r>
-        <w:rPr>
-          <w:rFonts w:cs="Calibri"/>
-          <w:b/>
-          <w:bCs/>
-          <w:i/>
-          <w:iCs/>
-          <w:color w:val="000000" w:themeColor="text1"/>
-        </w:rPr>
-        <w:t xml:space="preserve"> </w:t>
-      </w:r>
-      <w:r>
-        <w:rPr>
-          <w:rFonts w:cs="Calibri"/>
-          <w:b/>
-          <w:bCs/>
-          <w:i/>
-          <w:iCs/>
-          <w:color w:val="000000" w:themeColor="text1"/>
-          <w:highlight w:val="yellow"/>
-        </w:rPr>
-        <w:t>Our results suggest concerns in the ability of surgical RCTs to inform clinical decision-making.</w:t>
-      </w:r>
-    </w:p>
-    <w:p/>
-    <w:p>
-      <w:pPr>
-        <w:rPr>
-          <w:rFonts w:ascii="Arial" w:hAnsi="Arial" w:cs="Arial"/>
-        </w:rPr>
-      </w:pPr>
-      <w:r>
-        <w:rPr>
-          <w:rFonts w:ascii="Arial" w:hAnsi="Arial" w:cs="Arial"/>
-        </w:rPr>
-        <w:t>- the composite definition of meaningfully informing clinical practice is crucial to this manuscript. And as mentioned also one of its strengths. The definition would benefit from a clear description how MID are defined. How should these be formed: Delphi methods for treating physicians and focus groups for patients ? This is the crux for future designs. These outcomes need to be properly defined and validated. Please comment and comment on in discussion.</w:t>
+        <w:rPr>
+          <w:rFonts w:ascii="Arial" w:hAnsi="Arial" w:cs="Arial"/>
+          <w:i/>
+          <w:iCs/>
+          <w:color w:val="0F4761" w:themeColor="accent1" w:themeShade="BF"/>
+        </w:rPr>
+      </w:pPr>
+    </w:p>
+    <w:p>
+      <w:pPr>
+        <w:rPr>
+          <w:rFonts w:ascii="Arial" w:hAnsi="Arial" w:cs="Arial"/>
+          <w:i/>
+          <w:iCs/>
+          <w:color w:val="0F4761" w:themeColor="accent1" w:themeShade="BF"/>
+        </w:rPr>
+      </w:pPr>
+    </w:p>
+    <w:p>
+      <w:pPr>
+        <w:rPr>
+          <w:rFonts w:ascii="Arial" w:hAnsi="Arial" w:cs="Arial"/>
+        </w:rPr>
+      </w:pPr>
+      <w:r>
+        <w:rPr>
+          <w:rFonts w:ascii="Arial" w:hAnsi="Arial" w:cs="Arial"/>
+        </w:rPr>
+        <w:t>- The authors report that 19,393 RCT records from 2024 were identified. But only 554 records were screened, resulting in 167 included RCTs</w:t>
+      </w:r>
+    </w:p>
+    <w:p>
+      <w:pPr>
+        <w:rPr>
+          <w:rFonts w:ascii="Arial" w:hAnsi="Arial" w:cs="Arial"/>
+        </w:rPr>
+      </w:pPr>
+      <w:r>
+        <w:rPr>
+          <w:rFonts w:ascii="Arial" w:hAnsi="Arial" w:cs="Arial"/>
+        </w:rPr>
+        <w:t>However, the manuscript provides no clear justification for why this subset was selected, nor does it demonstrate that the final sample is representative of the overall surgical RCT literature. Was the sample randomly selected? Were records screened in chronological order? Could selection bias have influenced which studies were included? Final conclusion should reflect this methodological flaw and be somewhat less strong</w:t>
       </w:r>
     </w:p>
     <w:p>
@@ -1776,477 +2192,7 @@
           <w:iCs/>
           <w:color w:val="0F4761" w:themeColor="accent1" w:themeShade="BF"/>
         </w:rPr>
-        <w:t xml:space="preserve">: We thank the reviewer for </w:t>
-      </w:r>
-      <w:r>
-        <w:rPr>
-          <w:rFonts w:ascii="Arial" w:hAnsi="Arial" w:cs="Arial"/>
-          <w:i/>
-          <w:iCs/>
-          <w:color w:val="0F4761" w:themeColor="accent1" w:themeShade="BF"/>
-        </w:rPr>
-        <w:t>highlighting</w:t>
-      </w:r>
-      <w:r>
-        <w:rPr>
-          <w:rFonts w:ascii="Arial" w:hAnsi="Arial" w:cs="Arial"/>
-          <w:i/>
-          <w:iCs/>
-          <w:color w:val="0F4761" w:themeColor="accent1" w:themeShade="BF"/>
-        </w:rPr>
-        <w:t xml:space="preserve"> </w:t>
-      </w:r>
-      <w:r>
-        <w:rPr>
-          <w:rFonts w:ascii="Arial" w:hAnsi="Arial" w:cs="Arial"/>
-          <w:i/>
-          <w:iCs/>
-          <w:color w:val="0F4761" w:themeColor="accent1" w:themeShade="BF"/>
-        </w:rPr>
-        <w:t xml:space="preserve">the strength of </w:t>
-      </w:r>
-      <w:r>
-        <w:rPr>
-          <w:rFonts w:ascii="Arial" w:hAnsi="Arial" w:cs="Arial"/>
-          <w:i/>
-          <w:iCs/>
-          <w:color w:val="0F4761" w:themeColor="accent1" w:themeShade="BF"/>
-        </w:rPr>
-        <w:t xml:space="preserve">our </w:t>
-      </w:r>
-      <w:r>
-        <w:rPr>
-          <w:rFonts w:ascii="Arial" w:hAnsi="Arial" w:cs="Arial"/>
-          <w:i/>
-          <w:iCs/>
-          <w:color w:val="0F4761" w:themeColor="accent1" w:themeShade="BF"/>
-        </w:rPr>
-        <w:t xml:space="preserve">original definition. As its understanding is dependent on the MID concept, we added in </w:t>
-      </w:r>
-      <w:r>
-        <w:rPr>
-          <w:rFonts w:ascii="Arial" w:hAnsi="Arial" w:cs="Arial"/>
-          <w:b/>
-          <w:bCs/>
-          <w:i/>
-          <w:iCs/>
-          <w:color w:val="0F4761" w:themeColor="accent1" w:themeShade="BF"/>
-        </w:rPr>
-        <w:t>Methods</w:t>
-      </w:r>
-      <w:r>
-        <w:rPr>
-          <w:rFonts w:ascii="Arial" w:hAnsi="Arial" w:cs="Arial"/>
-          <w:i/>
-          <w:iCs/>
-          <w:color w:val="0F4761" w:themeColor="accent1" w:themeShade="BF"/>
-        </w:rPr>
-        <w:t xml:space="preserve"> section a</w:t>
-      </w:r>
-      <w:r>
-        <w:rPr>
-          <w:rFonts w:ascii="Arial" w:hAnsi="Arial" w:cs="Arial"/>
-          <w:i/>
-          <w:iCs/>
-          <w:color w:val="0F4761" w:themeColor="accent1" w:themeShade="BF"/>
-        </w:rPr>
-        <w:t xml:space="preserve"> subsection </w:t>
-      </w:r>
-      <w:r>
-        <w:rPr>
-          <w:rFonts w:ascii="Arial" w:hAnsi="Arial" w:cs="Arial"/>
-          <w:b/>
-          <w:bCs/>
-          <w:i/>
-          <w:iCs/>
-          <w:color w:val="0F4761" w:themeColor="accent1" w:themeShade="BF"/>
-        </w:rPr>
-        <w:t>Outcomes definition</w:t>
-      </w:r>
-      <w:r>
-        <w:rPr>
-          <w:rFonts w:ascii="Arial" w:hAnsi="Arial" w:cs="Arial"/>
-          <w:i/>
-          <w:iCs/>
-          <w:color w:val="0F4761" w:themeColor="accent1" w:themeShade="BF"/>
-        </w:rPr>
-        <w:t xml:space="preserve"> with four distinct paragraphs. Each</w:t>
-      </w:r>
-      <w:r>
-        <w:rPr>
-          <w:rFonts w:ascii="Arial" w:hAnsi="Arial" w:cs="Arial"/>
-          <w:i/>
-          <w:iCs/>
-          <w:color w:val="0F4761" w:themeColor="accent1" w:themeShade="BF"/>
-        </w:rPr>
-        <w:t xml:space="preserve"> </w:t>
-      </w:r>
-      <w:r>
-        <w:rPr>
-          <w:rFonts w:ascii="Arial" w:hAnsi="Arial" w:cs="Arial"/>
-          <w:i/>
-          <w:iCs/>
-          <w:color w:val="0F4761" w:themeColor="accent1" w:themeShade="BF"/>
-        </w:rPr>
-        <w:t>paragraph defin</w:t>
-      </w:r>
-      <w:r>
-        <w:rPr>
-          <w:rFonts w:ascii="Arial" w:hAnsi="Arial" w:cs="Arial"/>
-          <w:i/>
-          <w:iCs/>
-          <w:color w:val="0F4761" w:themeColor="accent1" w:themeShade="BF"/>
-        </w:rPr>
-        <w:t>es now</w:t>
-      </w:r>
-      <w:r>
-        <w:rPr>
-          <w:rFonts w:ascii="Arial" w:hAnsi="Arial" w:cs="Arial"/>
-          <w:i/>
-          <w:iCs/>
-          <w:color w:val="0F4761" w:themeColor="accent1" w:themeShade="BF"/>
-        </w:rPr>
-        <w:t xml:space="preserve"> each </w:t>
-      </w:r>
-      <w:r>
-        <w:rPr>
-          <w:rFonts w:ascii="Arial" w:hAnsi="Arial" w:cs="Arial"/>
-          <w:i/>
-          <w:iCs/>
-          <w:color w:val="0F4761" w:themeColor="accent1" w:themeShade="BF"/>
-        </w:rPr>
-        <w:t>criterium</w:t>
-      </w:r>
-      <w:r>
-        <w:rPr>
-          <w:rFonts w:ascii="Arial" w:hAnsi="Arial" w:cs="Arial"/>
-          <w:i/>
-          <w:iCs/>
-          <w:color w:val="0F4761" w:themeColor="accent1" w:themeShade="BF"/>
-        </w:rPr>
-        <w:t xml:space="preserve"> of our </w:t>
-      </w:r>
-      <w:r>
-        <w:rPr>
-          <w:rFonts w:ascii="Arial" w:hAnsi="Arial" w:cs="Arial"/>
-          <w:i/>
-          <w:iCs/>
-          <w:color w:val="0F4761" w:themeColor="accent1" w:themeShade="BF"/>
-        </w:rPr>
-        <w:t xml:space="preserve">four-point </w:t>
-      </w:r>
-      <w:r>
-        <w:rPr>
-          <w:rFonts w:ascii="Arial" w:hAnsi="Arial" w:cs="Arial"/>
-          <w:i/>
-          <w:iCs/>
-          <w:color w:val="0F4761" w:themeColor="accent1" w:themeShade="BF"/>
-        </w:rPr>
-        <w:t xml:space="preserve">composite outcome and </w:t>
-      </w:r>
-      <w:r>
-        <w:rPr>
-          <w:rFonts w:ascii="Arial" w:hAnsi="Arial" w:cs="Arial"/>
-          <w:i/>
-          <w:iCs/>
-          <w:color w:val="0F4761" w:themeColor="accent1" w:themeShade="BF"/>
-        </w:rPr>
-        <w:t xml:space="preserve">we </w:t>
-      </w:r>
-      <w:r>
-        <w:rPr>
-          <w:rFonts w:ascii="Arial" w:hAnsi="Arial" w:cs="Arial"/>
-          <w:i/>
-          <w:iCs/>
-          <w:color w:val="0F4761" w:themeColor="accent1" w:themeShade="BF"/>
-        </w:rPr>
-        <w:t xml:space="preserve">define the MID in the paragraph </w:t>
-      </w:r>
-      <w:r>
-        <w:rPr>
-          <w:rFonts w:ascii="Arial" w:hAnsi="Arial" w:cs="Arial"/>
-          <w:b/>
-          <w:bCs/>
-          <w:i/>
-          <w:iCs/>
-          <w:color w:val="0F4761" w:themeColor="accent1" w:themeShade="BF"/>
-        </w:rPr>
-        <w:t>Sample size based on a clinically relevant effect</w:t>
-      </w:r>
-      <w:r>
-        <w:rPr>
-          <w:rFonts w:ascii="Arial" w:hAnsi="Arial" w:cs="Arial"/>
-          <w:i/>
-          <w:iCs/>
-          <w:color w:val="0F4761" w:themeColor="accent1" w:themeShade="BF"/>
-        </w:rPr>
-        <w:t xml:space="preserve">. We also ensured that we did not repeat these elements in the </w:t>
-      </w:r>
-      <w:r>
-        <w:rPr>
-          <w:rFonts w:ascii="Arial" w:hAnsi="Arial" w:cs="Arial"/>
-          <w:b/>
-          <w:bCs/>
-          <w:i/>
-          <w:iCs/>
-          <w:color w:val="0F4761" w:themeColor="accent1" w:themeShade="BF"/>
-        </w:rPr>
-        <w:t>Discussion</w:t>
-      </w:r>
-      <w:r>
-        <w:rPr>
-          <w:rFonts w:ascii="Arial" w:hAnsi="Arial" w:cs="Arial"/>
-          <w:i/>
-          <w:iCs/>
-          <w:color w:val="0F4761" w:themeColor="accent1" w:themeShade="BF"/>
-        </w:rPr>
-        <w:t xml:space="preserve"> section, as we had already dedicated a paragraph to the MID</w:t>
-      </w:r>
-      <w:r>
-        <w:rPr>
-          <w:rFonts w:ascii="Arial" w:hAnsi="Arial" w:cs="Arial"/>
-          <w:i/>
-          <w:iCs/>
-          <w:color w:val="0F4761" w:themeColor="accent1" w:themeShade="BF"/>
-        </w:rPr>
-        <w:t>.</w:t>
-      </w:r>
-    </w:p>
-    <w:p>
-      <w:pPr>
-        <w:rPr>
-          <w:rFonts w:ascii="Arial" w:hAnsi="Arial" w:cs="Arial"/>
-          <w:i/>
-          <w:iCs/>
-          <w:color w:val="0F4761" w:themeColor="accent1" w:themeShade="BF"/>
-        </w:rPr>
-      </w:pPr>
-    </w:p>
-    <w:p>
-      <w:pPr>
-        <w:rPr>
-          <w:rFonts w:ascii="Arial" w:hAnsi="Arial" w:cs="Arial"/>
-          <w:i/>
-          <w:iCs/>
-          <w:color w:val="0F4761" w:themeColor="accent1" w:themeShade="BF"/>
-        </w:rPr>
-      </w:pPr>
-      <w:r>
-        <w:rPr>
-          <w:i/>
-          <w:iCs/>
-          <w:color w:val="0F4761" w:themeColor="accent1" w:themeShade="BF"/>
-        </w:rPr>
-        <w:t>Extracted from</w:t>
-      </w:r>
-      <w:r>
-        <w:rPr>
-          <w:rFonts w:ascii="Arial" w:hAnsi="Arial" w:cs="Arial"/>
-          <w:i/>
-          <w:iCs/>
-          <w:color w:val="0F4761" w:themeColor="accent1" w:themeShade="BF"/>
-        </w:rPr>
-        <w:t xml:space="preserve"> </w:t>
-      </w:r>
-      <w:r>
-        <w:rPr>
-          <w:rFonts w:ascii="Arial" w:hAnsi="Arial" w:cs="Arial"/>
-          <w:b/>
-          <w:bCs/>
-          <w:i/>
-          <w:iCs/>
-          <w:color w:val="0F4761" w:themeColor="accent1" w:themeShade="BF"/>
-        </w:rPr>
-        <w:t>Methods</w:t>
-      </w:r>
-      <w:r>
-        <w:rPr>
-          <w:rFonts w:ascii="Arial" w:hAnsi="Arial" w:cs="Arial"/>
-          <w:b/>
-          <w:bCs/>
-          <w:i/>
-          <w:iCs/>
-          <w:color w:val="0F4761" w:themeColor="accent1" w:themeShade="BF"/>
-        </w:rPr>
-        <w:t xml:space="preserve"> (page)</w:t>
-      </w:r>
-      <w:r>
-        <w:rPr>
-          <w:rFonts w:ascii="Arial" w:hAnsi="Arial" w:cs="Arial"/>
-          <w:i/>
-          <w:iCs/>
-          <w:color w:val="0F4761" w:themeColor="accent1" w:themeShade="BF"/>
-        </w:rPr>
-        <w:t>:</w:t>
-      </w:r>
-    </w:p>
-    <w:p>
-      <w:pPr>
-        <w:rPr>
-          <w:rFonts w:ascii="Arial" w:hAnsi="Arial" w:cs="Arial"/>
-          <w:i/>
-          <w:iCs/>
-          <w:color w:val="0F4761" w:themeColor="accent1" w:themeShade="BF"/>
-        </w:rPr>
-      </w:pPr>
-    </w:p>
-    <w:p>
-      <w:pPr>
-        <w:rPr>
-          <w:rFonts w:ascii="Arial" w:hAnsi="Arial" w:cs="Arial"/>
-          <w:i/>
-          <w:iCs/>
-          <w:color w:val="0F4761" w:themeColor="accent1" w:themeShade="BF"/>
-        </w:rPr>
-      </w:pPr>
-    </w:p>
-    <w:p>
-      <w:pPr>
-        <w:rPr>
-          <w:rFonts w:ascii="Arial" w:hAnsi="Arial" w:cs="Arial"/>
-          <w:i/>
-          <w:iCs/>
-          <w:color w:val="0F4761" w:themeColor="accent1" w:themeShade="BF"/>
-        </w:rPr>
-      </w:pPr>
-      <w:r>
-        <w:rPr>
-          <w:i/>
-          <w:iCs/>
-          <w:color w:val="0F4761" w:themeColor="accent1" w:themeShade="BF"/>
-        </w:rPr>
-        <w:t>Extracted from</w:t>
-      </w:r>
-      <w:r>
-        <w:rPr>
-          <w:rFonts w:ascii="Arial" w:hAnsi="Arial" w:cs="Arial"/>
-          <w:i/>
-          <w:iCs/>
-          <w:color w:val="0F4761" w:themeColor="accent1" w:themeShade="BF"/>
-        </w:rPr>
-        <w:t xml:space="preserve"> </w:t>
-      </w:r>
-      <w:r>
-        <w:rPr>
-          <w:rFonts w:ascii="Arial" w:hAnsi="Arial" w:cs="Arial"/>
-          <w:b/>
-          <w:bCs/>
-          <w:i/>
-          <w:iCs/>
-          <w:color w:val="0F4761" w:themeColor="accent1" w:themeShade="BF"/>
-        </w:rPr>
-        <w:t>Discussion</w:t>
-      </w:r>
-      <w:r>
-        <w:rPr>
-          <w:rFonts w:ascii="Arial" w:hAnsi="Arial" w:cs="Arial"/>
-          <w:b/>
-          <w:bCs/>
-          <w:i/>
-          <w:iCs/>
-          <w:color w:val="0F4761" w:themeColor="accent1" w:themeShade="BF"/>
-        </w:rPr>
-        <w:t xml:space="preserve"> (page)</w:t>
-      </w:r>
-      <w:r>
-        <w:rPr>
-          <w:rFonts w:ascii="Arial" w:hAnsi="Arial" w:cs="Arial"/>
-          <w:i/>
-          <w:iCs/>
-          <w:color w:val="0F4761" w:themeColor="accent1" w:themeShade="BF"/>
-        </w:rPr>
-        <w:t>:</w:t>
-      </w:r>
-    </w:p>
-    <w:p>
-      <w:pPr>
-        <w:rPr>
-          <w:rFonts w:ascii="Arial" w:hAnsi="Arial" w:cs="Arial"/>
-          <w:i/>
-          <w:iCs/>
-          <w:color w:val="0F4761" w:themeColor="accent1" w:themeShade="BF"/>
-        </w:rPr>
-      </w:pPr>
-    </w:p>
-    <w:p>
-      <w:pPr>
-        <w:rPr>
-          <w:rFonts w:ascii="Arial" w:hAnsi="Arial" w:cs="Arial"/>
-          <w:i/>
-          <w:iCs/>
-          <w:color w:val="0F4761" w:themeColor="accent1" w:themeShade="BF"/>
-        </w:rPr>
-      </w:pPr>
-    </w:p>
-    <w:p>
-      <w:pPr>
-        <w:rPr>
-          <w:rFonts w:ascii="Arial" w:hAnsi="Arial" w:cs="Arial"/>
-        </w:rPr>
-      </w:pPr>
-      <w:r>
-        <w:rPr>
-          <w:rFonts w:ascii="Arial" w:hAnsi="Arial" w:cs="Arial"/>
-        </w:rPr>
-        <w:t>- The authors report that 19,393 RCT records from 2024 were identified. But only 554 records were screened, resulting in 167 included RCTs</w:t>
-      </w:r>
-    </w:p>
-    <w:p>
-      <w:pPr>
-        <w:rPr>
-          <w:rFonts w:ascii="Arial" w:hAnsi="Arial" w:cs="Arial"/>
-        </w:rPr>
-      </w:pPr>
-      <w:r>
-        <w:rPr>
-          <w:rFonts w:ascii="Arial" w:hAnsi="Arial" w:cs="Arial"/>
-        </w:rPr>
-        <w:t>However, the manuscript provides no clear justification for why this subset was selected, nor does it demonstrate that the final sample is representative of the overall surgical RCT literature. Was the sample randomly selected? Were records screened in chronological order? Could selection bias have influenced which studies were included? Final conclusion should reflect this methodological flaw and be somewhat less strong</w:t>
-      </w:r>
-    </w:p>
-    <w:p>
-      <w:pPr>
-        <w:rPr>
-          <w:rFonts w:ascii="Arial" w:hAnsi="Arial" w:cs="Arial"/>
-        </w:rPr>
-      </w:pPr>
-    </w:p>
-    <w:p>
-      <w:pPr>
-        <w:rPr>
-          <w:rFonts w:ascii="Arial" w:hAnsi="Arial" w:cs="Arial"/>
-          <w:i/>
-          <w:iCs/>
-          <w:color w:val="0F4761" w:themeColor="accent1" w:themeShade="BF"/>
-        </w:rPr>
-      </w:pPr>
-      <w:r>
-        <w:rPr>
-          <w:rFonts w:ascii="Arial" w:hAnsi="Arial" w:cs="Arial"/>
-          <w:i/>
-          <w:iCs/>
-          <w:color w:val="0F4761" w:themeColor="accent1" w:themeShade="BF"/>
-          <w:u w:val="single"/>
-        </w:rPr>
-        <w:t>Answer</w:t>
-      </w:r>
-      <w:r>
-        <w:rPr>
-          <w:rFonts w:ascii="Arial" w:hAnsi="Arial" w:cs="Arial"/>
-          <w:i/>
-          <w:iCs/>
-          <w:color w:val="0F4761" w:themeColor="accent1" w:themeShade="BF"/>
-        </w:rPr>
-        <w:t xml:space="preserve">: We thank the reviewer for </w:t>
-      </w:r>
-      <w:r>
-        <w:rPr>
-          <w:rFonts w:ascii="Arial" w:hAnsi="Arial" w:cs="Arial"/>
-          <w:i/>
-          <w:iCs/>
-          <w:color w:val="0F4761" w:themeColor="accent1" w:themeShade="BF"/>
-        </w:rPr>
-        <w:t>pointing out a lack in clarity concerning the selection process, which we had initially not detailed for word sparing purposes, but which was not sufficiently well reported. We</w:t>
+        <w:t>: We thank the reviewer for pointing out a lack in clarity concerning the selection process, which we had initially not detailed for word sparing purposes, but which was not sufficiently well reported. We</w:t>
       </w:r>
       <w:r>
         <w:rPr>
@@ -2626,52 +2572,7 @@
           <w:iCs/>
           <w:color w:val="0F4761" w:themeColor="accent1" w:themeShade="BF"/>
         </w:rPr>
-        <w:t xml:space="preserve">: We </w:t>
-      </w:r>
-      <w:r>
-        <w:rPr>
-          <w:rFonts w:ascii="Arial" w:hAnsi="Arial" w:cs="Arial"/>
-          <w:i/>
-          <w:iCs/>
-          <w:color w:val="0F4761" w:themeColor="accent1" w:themeShade="BF"/>
-        </w:rPr>
-        <w:t>are thankful to</w:t>
-      </w:r>
-      <w:r>
-        <w:rPr>
-          <w:rFonts w:ascii="Arial" w:hAnsi="Arial" w:cs="Arial"/>
-          <w:i/>
-          <w:iCs/>
-          <w:color w:val="0F4761" w:themeColor="accent1" w:themeShade="BF"/>
-        </w:rPr>
-        <w:t xml:space="preserve"> the reviewer </w:t>
-      </w:r>
-      <w:r>
-        <w:rPr>
-          <w:rFonts w:ascii="Arial" w:hAnsi="Arial" w:cs="Arial"/>
-          <w:i/>
-          <w:iCs/>
-          <w:color w:val="0F4761" w:themeColor="accent1" w:themeShade="BF"/>
-        </w:rPr>
-        <w:t>to suggest</w:t>
-      </w:r>
-      <w:r>
-        <w:rPr>
-          <w:rFonts w:ascii="Arial" w:hAnsi="Arial" w:cs="Arial"/>
-          <w:i/>
-          <w:iCs/>
-          <w:color w:val="0F4761" w:themeColor="accent1" w:themeShade="BF"/>
-        </w:rPr>
-        <w:t xml:space="preserve"> </w:t>
-      </w:r>
-      <w:r>
-        <w:rPr>
-          <w:rFonts w:ascii="Arial" w:hAnsi="Arial" w:cs="Arial"/>
-          <w:i/>
-          <w:iCs/>
-          <w:color w:val="0F4761" w:themeColor="accent1" w:themeShade="BF"/>
-        </w:rPr>
-        <w:t xml:space="preserve">this area of improvement, allowing our </w:t>
+        <w:t xml:space="preserve">: We are thankful to the reviewer to suggest this area of improvement, allowing our </w:t>
       </w:r>
       <w:r>
         <w:rPr>
@@ -2718,70 +2619,7 @@
           <w:iCs/>
           <w:color w:val="0F4761" w:themeColor="accent1" w:themeShade="BF"/>
         </w:rPr>
-        <w:t xml:space="preserve">s to </w:t>
-      </w:r>
-      <w:r>
-        <w:rPr>
-          <w:rFonts w:ascii="Arial" w:hAnsi="Arial" w:cs="Arial"/>
-          <w:i/>
-          <w:iCs/>
-          <w:color w:val="0F4761" w:themeColor="accent1" w:themeShade="BF"/>
-        </w:rPr>
-        <w:t>meaningfu</w:t>
-      </w:r>
-      <w:r>
-        <w:rPr>
-          <w:rFonts w:ascii="Arial" w:hAnsi="Arial" w:cs="Arial"/>
-          <w:i/>
-          <w:iCs/>
-          <w:color w:val="0F4761" w:themeColor="accent1" w:themeShade="BF"/>
-        </w:rPr>
-        <w:t>l</w:t>
-      </w:r>
-      <w:r>
-        <w:rPr>
-          <w:rFonts w:ascii="Arial" w:hAnsi="Arial" w:cs="Arial"/>
-          <w:i/>
-          <w:iCs/>
-          <w:color w:val="0F4761" w:themeColor="accent1" w:themeShade="BF"/>
-        </w:rPr>
-        <w:t>l</w:t>
-      </w:r>
-      <w:r>
-        <w:rPr>
-          <w:rFonts w:ascii="Arial" w:hAnsi="Arial" w:cs="Arial"/>
-          <w:i/>
-          <w:iCs/>
-          <w:color w:val="0F4761" w:themeColor="accent1" w:themeShade="BF"/>
-        </w:rPr>
-        <w:t>y</w:t>
-      </w:r>
-      <w:r>
-        <w:rPr>
-          <w:rFonts w:ascii="Arial" w:hAnsi="Arial" w:cs="Arial"/>
-          <w:i/>
-          <w:iCs/>
-          <w:color w:val="0F4761" w:themeColor="accent1" w:themeShade="BF"/>
-        </w:rPr>
-        <w:t xml:space="preserve"> </w:t>
-      </w:r>
-      <w:r>
-        <w:rPr>
-          <w:rFonts w:ascii="Arial" w:hAnsi="Arial" w:cs="Arial"/>
-          <w:i/>
-          <w:iCs/>
-          <w:color w:val="0F4761" w:themeColor="accent1" w:themeShade="BF"/>
-        </w:rPr>
-        <w:t>inform</w:t>
-      </w:r>
-      <w:r>
-        <w:rPr>
-          <w:rFonts w:ascii="Arial" w:hAnsi="Arial" w:cs="Arial"/>
-          <w:i/>
-          <w:iCs/>
-          <w:color w:val="0F4761" w:themeColor="accent1" w:themeShade="BF"/>
-        </w:rPr>
-        <w:t xml:space="preserve"> </w:t>
+        <w:t xml:space="preserve">s to meaningfully inform </w:t>
       </w:r>
       <w:r>
         <w:rPr>
@@ -3016,11 +2854,10 @@
       <w:pPr>
         <w:textAlignment w:val="baseline"/>
         <w:rPr>
-          <w:rFonts w:ascii="Arial" w:eastAsia="Times New Roman" w:hAnsi="Arial" w:cs="Arial"/>
-          <w:i/>
-          <w:iCs/>
-          <w:color w:val="0F4761" w:themeColor="accent1" w:themeShade="BF"/>
-          <w:szCs w:val="22"/>
+          <w:rFonts w:ascii="Arial" w:hAnsi="Arial" w:cs="Arial"/>
+          <w:i/>
+          <w:iCs/>
+          <w:color w:val="0F4761" w:themeColor="accent1" w:themeShade="BF"/>
         </w:rPr>
       </w:pPr>
       <w:r>
@@ -3049,18 +2886,493 @@
           <w:iCs/>
           <w:color w:val="0F4761" w:themeColor="accent1" w:themeShade="BF"/>
         </w:rPr>
+        <w:t xml:space="preserve"> expressing their concern, which we can </w:t>
+      </w:r>
+      <w:r>
+        <w:rPr>
+          <w:rFonts w:ascii="Arial" w:hAnsi="Arial" w:cs="Arial"/>
+          <w:i/>
+          <w:iCs/>
+          <w:color w:val="0F4761" w:themeColor="accent1" w:themeShade="BF"/>
+        </w:rPr>
+        <w:t xml:space="preserve">address confidently. Our first systematic part of this manuscript was a pilot phase, aiming to develop and refine different criteria to assess the ability of RCTs to </w:t>
+      </w:r>
+      <w:r>
+        <w:rPr>
+          <w:rFonts w:ascii="Arial" w:hAnsi="Arial" w:cs="Arial"/>
+          <w:i/>
+          <w:iCs/>
+          <w:color w:val="0F4761" w:themeColor="accent1" w:themeShade="BF"/>
+        </w:rPr>
+        <w:t xml:space="preserve">inform clinical practice. We also practiced the independent assessment in parallel of RCTs against our criteria to underscore the objectivity of our tool (see </w:t>
+      </w:r>
+      <w:r>
+        <w:rPr>
+          <w:rFonts w:ascii="Arial" w:hAnsi="Arial" w:cs="Arial"/>
+          <w:b/>
+          <w:bCs/>
+          <w:i/>
+          <w:iCs/>
+          <w:color w:val="0F4761" w:themeColor="accent1" w:themeShade="BF"/>
+        </w:rPr>
+        <w:t>supplemental digital conten</w:t>
+      </w:r>
+      <w:r>
+        <w:rPr>
+          <w:rFonts w:ascii="Arial" w:hAnsi="Arial" w:cs="Arial"/>
+          <w:b/>
+          <w:bCs/>
+          <w:i/>
+          <w:iCs/>
+          <w:color w:val="0F4761" w:themeColor="accent1" w:themeShade="BF"/>
+        </w:rPr>
+        <w:t>t 1</w:t>
+      </w:r>
+      <w:r>
+        <w:rPr>
+          <w:rFonts w:ascii="Arial" w:hAnsi="Arial" w:cs="Arial"/>
+          <w:i/>
+          <w:iCs/>
+          <w:color w:val="0F4761" w:themeColor="accent1" w:themeShade="BF"/>
+        </w:rPr>
+        <w:t xml:space="preserve">, attached below our answer). We then could use it with more expertise for the final phase, which consisted in a survey of a random sample of </w:t>
+      </w:r>
+      <w:r>
+        <w:rPr>
+          <w:rFonts w:ascii="Arial" w:hAnsi="Arial" w:cs="Arial"/>
+          <w:i/>
+          <w:iCs/>
+          <w:color w:val="0F4761" w:themeColor="accent1" w:themeShade="BF"/>
+        </w:rPr>
+        <w:t xml:space="preserve">contemporary </w:t>
+      </w:r>
+      <w:r>
+        <w:rPr>
+          <w:rFonts w:ascii="Arial" w:hAnsi="Arial" w:cs="Arial"/>
+          <w:i/>
+          <w:iCs/>
+          <w:color w:val="0F4761" w:themeColor="accent1" w:themeShade="BF"/>
+        </w:rPr>
+        <w:t>surgical RCTs, to assess how any surgical RCT, regardless of the clinical orientation of the endpoint(s), did fulfill each criterion, and ultimately, our composite endpoint</w:t>
+      </w:r>
+      <w:r>
+        <w:rPr>
+          <w:rFonts w:ascii="Arial" w:hAnsi="Arial" w:cs="Arial"/>
+          <w:i/>
+          <w:iCs/>
+          <w:color w:val="0F4761" w:themeColor="accent1" w:themeShade="BF"/>
+        </w:rPr>
+        <w:t xml:space="preserve">. </w:t>
+      </w:r>
+      <w:r>
+        <w:rPr>
+          <w:rFonts w:ascii="Arial" w:hAnsi="Arial" w:cs="Arial"/>
+          <w:i/>
+          <w:iCs/>
+          <w:color w:val="0F4761" w:themeColor="accent1" w:themeShade="BF"/>
+        </w:rPr>
+        <w:t xml:space="preserve">We incorporated more clearly these points across the </w:t>
+      </w:r>
+      <w:r>
+        <w:rPr>
+          <w:rFonts w:ascii="Arial" w:hAnsi="Arial" w:cs="Arial"/>
+          <w:b/>
+          <w:bCs/>
+          <w:i/>
+          <w:iCs/>
+          <w:color w:val="0F4761" w:themeColor="accent1" w:themeShade="BF"/>
+        </w:rPr>
+        <w:t>Discussion</w:t>
+      </w:r>
+      <w:r>
+        <w:rPr>
+          <w:rFonts w:ascii="Arial" w:hAnsi="Arial" w:cs="Arial"/>
+          <w:i/>
+          <w:iCs/>
+          <w:color w:val="0F4761" w:themeColor="accent1" w:themeShade="BF"/>
+        </w:rPr>
+        <w:t xml:space="preserve"> section.</w:t>
+      </w:r>
+    </w:p>
+    <w:p>
+      <w:pPr>
+        <w:rPr>
+          <w:rFonts w:ascii="Arial" w:hAnsi="Arial" w:cs="Arial"/>
+          <w:i/>
+          <w:iCs/>
+          <w:color w:val="0F4761" w:themeColor="accent1" w:themeShade="BF"/>
+        </w:rPr>
+      </w:pPr>
+    </w:p>
+    <w:p>
+      <w:pPr>
+        <w:rPr>
+          <w:rFonts w:ascii="Arial" w:hAnsi="Arial" w:cs="Arial"/>
+          <w:i/>
+          <w:iCs/>
+          <w:color w:val="0F4761" w:themeColor="accent1" w:themeShade="BF"/>
+        </w:rPr>
+      </w:pPr>
+      <w:r>
+        <w:rPr>
+          <w:rFonts w:ascii="Arial" w:hAnsi="Arial" w:cs="Arial"/>
+          <w:i/>
+          <w:iCs/>
+          <w:color w:val="0F4761" w:themeColor="accent1" w:themeShade="BF"/>
+        </w:rPr>
+        <w:t xml:space="preserve">Extracted from </w:t>
+      </w:r>
+      <w:r>
+        <w:rPr>
+          <w:rFonts w:ascii="Arial" w:hAnsi="Arial" w:cs="Arial"/>
+          <w:b/>
+          <w:bCs/>
+          <w:i/>
+          <w:iCs/>
+          <w:color w:val="0F4761" w:themeColor="accent1" w:themeShade="BF"/>
+        </w:rPr>
+        <w:t>S</w:t>
+      </w:r>
+      <w:r>
+        <w:rPr>
+          <w:rFonts w:ascii="Arial" w:hAnsi="Arial" w:cs="Arial"/>
+          <w:b/>
+          <w:bCs/>
+          <w:i/>
+          <w:iCs/>
+          <w:color w:val="0F4761" w:themeColor="accent1" w:themeShade="BF"/>
+        </w:rPr>
+        <w:t>upplemental digital content</w:t>
+      </w:r>
+      <w:r>
+        <w:rPr>
+          <w:rFonts w:ascii="Arial" w:hAnsi="Arial" w:cs="Arial"/>
+          <w:b/>
+          <w:bCs/>
+          <w:i/>
+          <w:iCs/>
+          <w:color w:val="0F4761" w:themeColor="accent1" w:themeShade="BF"/>
+        </w:rPr>
+        <w:t xml:space="preserve"> 1</w:t>
+      </w:r>
+      <w:r>
+        <w:rPr>
+          <w:rFonts w:ascii="Arial" w:hAnsi="Arial" w:cs="Arial"/>
+          <w:b/>
+          <w:bCs/>
+          <w:i/>
+          <w:iCs/>
+          <w:color w:val="0F4761" w:themeColor="accent1" w:themeShade="BF"/>
+        </w:rPr>
+        <w:t>:</w:t>
+      </w:r>
+    </w:p>
+    <w:p>
+      <w:pPr>
+        <w:textAlignment w:val="baseline"/>
+        <w:rPr>
+          <w:rFonts w:ascii="Arial" w:eastAsia="Times New Roman" w:hAnsi="Arial" w:cs="Arial"/>
+          <w:i/>
+          <w:iCs/>
+          <w:color w:val="0F4761" w:themeColor="accent1" w:themeShade="BF"/>
+          <w:szCs w:val="22"/>
+        </w:rPr>
+      </w:pPr>
+    </w:p>
+    <w:p>
+      <w:pPr>
+        <w:textAlignment w:val="baseline"/>
+        <w:rPr>
+          <w:rFonts w:ascii="Arial" w:eastAsia="Times New Roman" w:hAnsi="Arial" w:cs="Arial"/>
+          <w:color w:val="C82613"/>
+          <w:szCs w:val="22"/>
+        </w:rPr>
+      </w:pPr>
+    </w:p>
+    <w:p>
+      <w:pPr>
+        <w:textAlignment w:val="baseline"/>
+        <w:rPr>
+          <w:rFonts w:ascii="Arial" w:eastAsia="Times New Roman" w:hAnsi="Arial" w:cs="Arial"/>
+          <w:color w:val="000000"/>
+          <w:szCs w:val="22"/>
+        </w:rPr>
+      </w:pPr>
+      <w:r>
+        <w:rPr>
+          <w:rFonts w:ascii="Arial" w:eastAsia="Times New Roman" w:hAnsi="Arial" w:cs="Arial"/>
+          <w:color w:val="000000"/>
+          <w:szCs w:val="22"/>
+        </w:rPr>
+        <w:t>2. All of the parameters included in the 4-point composite endpoint are of major importance, but the composite endpoint is not a standardized method to assess trial quality and a minor limitation in one of these parameters does not absolutely define the RCT irrelevant. In addition, the assessment of "an RCT meaningfully informing clinical practice" is very difficult as the implementation of trial results is estimated to take a median of 17 years. The first two criteria are obvious, but #4 leaves a lot of room for interpretation and no standardization was performed for this outcome assessment. This is also true for #3, i.e., assessing the feasibility and accuracy of the sample size calculation is not a simple task. In my assessment, the non-standardized composite endpoint creates a major limitation of this study, and this limitation is naturally insuperable.</w:t>
+      </w:r>
+    </w:p>
+    <w:p>
+      <w:pPr>
+        <w:textAlignment w:val="baseline"/>
+        <w:rPr>
+          <w:rFonts w:ascii="Arial" w:eastAsia="Times New Roman" w:hAnsi="Arial" w:cs="Arial"/>
+          <w:color w:val="C82613"/>
+          <w:szCs w:val="22"/>
+        </w:rPr>
+      </w:pPr>
+    </w:p>
+    <w:p>
+      <w:pPr>
+        <w:rPr>
+          <w:rFonts w:ascii="Arial" w:eastAsia="Times New Roman" w:hAnsi="Arial" w:cs="Arial"/>
+          <w:i/>
+          <w:iCs/>
+          <w:color w:val="0F4761" w:themeColor="accent1" w:themeShade="BF"/>
+          <w:szCs w:val="22"/>
+          <w:bdr w:val="none" w:sz="0" w:space="0" w:color="auto" w:frame="1"/>
+        </w:rPr>
+      </w:pPr>
+      <w:commentRangeStart w:id="0"/>
+      <w:r>
+        <w:rPr>
+          <w:rFonts w:ascii="Arial" w:hAnsi="Arial" w:cs="Arial"/>
+          <w:i/>
+          <w:iCs/>
+          <w:color w:val="0F4761" w:themeColor="accent1" w:themeShade="BF"/>
+          <w:u w:val="single"/>
+        </w:rPr>
+        <w:t>Answer</w:t>
+      </w:r>
+      <w:r>
+        <w:rPr>
+          <w:rFonts w:ascii="Arial" w:hAnsi="Arial" w:cs="Arial"/>
+          <w:i/>
+          <w:iCs/>
+          <w:color w:val="0F4761" w:themeColor="accent1" w:themeShade="BF"/>
+        </w:rPr>
+        <w:t>: We thank the reviewer for</w:t>
+      </w:r>
+      <w:r>
+        <w:rPr>
+          <w:rFonts w:ascii="Arial" w:hAnsi="Arial" w:cs="Arial"/>
+          <w:i/>
+          <w:iCs/>
+          <w:color w:val="0F4761" w:themeColor="accent1" w:themeShade="BF"/>
+        </w:rPr>
+        <w:t xml:space="preserve"> unerlining the limits of our composite outcome and pointing out an area of improving the way we defined it. Besides citing and providing the complete reference of our protocol (doi and publicly available in OSF platform), we added </w:t>
+      </w:r>
+      <w:r>
+        <w:t>in</w:t>
+      </w:r>
+      <w:r>
+        <w:rPr>
+          <w:rFonts w:ascii="Arial" w:eastAsia="Times New Roman" w:hAnsi="Arial" w:cs="Arial"/>
+          <w:b/>
+          <w:bCs/>
+          <w:i/>
+          <w:iCs/>
+          <w:color w:val="0F4761" w:themeColor="accent1" w:themeShade="BF"/>
+          <w:szCs w:val="22"/>
+          <w:bdr w:val="none" w:sz="0" w:space="0" w:color="auto" w:frame="1"/>
+        </w:rPr>
         <w:t xml:space="preserve"> </w:t>
       </w:r>
       <w:r>
         <w:rPr>
           <w:rFonts w:ascii="Arial" w:eastAsia="Times New Roman" w:hAnsi="Arial" w:cs="Arial"/>
-          <w:i/>
-          <w:iCs/>
-          <w:color w:val="0F4761" w:themeColor="accent1" w:themeShade="BF"/>
-          <w:szCs w:val="22"/>
-          <w:bdr w:val="none" w:sz="0" w:space="0" w:color="auto" w:frame="1"/>
-        </w:rPr>
-        <w:t>--&gt; this is a bit complicated . I think the reviewer did not get that our main study is not based on the use of CCI but really an unbiased sample. emphaisze that the pilot study may be biased but helped us to establish the study procedures but that the main study is a consectuve sample in a certain period without the requirement of using the CCI. just go straight to that point and don't bring in any other points.</w:t>
+          <w:b/>
+          <w:bCs/>
+          <w:i/>
+          <w:iCs/>
+          <w:color w:val="0F4761" w:themeColor="accent1" w:themeShade="BF"/>
+          <w:szCs w:val="22"/>
+          <w:bdr w:val="none" w:sz="0" w:space="0" w:color="auto" w:frame="1"/>
+        </w:rPr>
+        <w:t>Methods </w:t>
+      </w:r>
+      <w:r>
+        <w:rPr>
+          <w:rFonts w:ascii="Arial" w:eastAsia="Times New Roman" w:hAnsi="Arial" w:cs="Arial"/>
+          <w:i/>
+          <w:iCs/>
+          <w:color w:val="0F4761" w:themeColor="accent1" w:themeShade="BF"/>
+          <w:szCs w:val="22"/>
+          <w:bdr w:val="none" w:sz="0" w:space="0" w:color="auto" w:frame="1"/>
+        </w:rPr>
+        <w:t xml:space="preserve">section </w:t>
+      </w:r>
+      <w:r>
+        <w:rPr>
+          <w:rFonts w:ascii="Arial" w:eastAsia="Times New Roman" w:hAnsi="Arial" w:cs="Arial"/>
+          <w:i/>
+          <w:iCs/>
+          <w:color w:val="0F4761" w:themeColor="accent1" w:themeShade="BF"/>
+          <w:szCs w:val="22"/>
+          <w:bdr w:val="none" w:sz="0" w:space="0" w:color="auto" w:frame="1"/>
+        </w:rPr>
+        <w:t xml:space="preserve">the subsection </w:t>
+      </w:r>
+      <w:r>
+        <w:rPr>
+          <w:rFonts w:ascii="Arial" w:eastAsia="Times New Roman" w:hAnsi="Arial" w:cs="Arial"/>
+          <w:b/>
+          <w:bCs/>
+          <w:i/>
+          <w:iCs/>
+          <w:color w:val="0F4761" w:themeColor="accent1" w:themeShade="BF"/>
+          <w:szCs w:val="22"/>
+          <w:bdr w:val="none" w:sz="0" w:space="0" w:color="auto" w:frame="1"/>
+        </w:rPr>
+        <w:t>Outcomes definition</w:t>
+      </w:r>
+      <w:r>
+        <w:rPr>
+          <w:rFonts w:ascii="Arial" w:eastAsia="Times New Roman" w:hAnsi="Arial" w:cs="Arial"/>
+          <w:b/>
+          <w:bCs/>
+          <w:i/>
+          <w:iCs/>
+          <w:color w:val="0F4761" w:themeColor="accent1" w:themeShade="BF"/>
+          <w:szCs w:val="22"/>
+          <w:bdr w:val="none" w:sz="0" w:space="0" w:color="auto" w:frame="1"/>
+        </w:rPr>
+        <w:t xml:space="preserve"> </w:t>
+      </w:r>
+      <w:r>
+        <w:rPr>
+          <w:rFonts w:ascii="Arial" w:eastAsia="Times New Roman" w:hAnsi="Arial" w:cs="Arial"/>
+          <w:i/>
+          <w:iCs/>
+          <w:color w:val="0F4761" w:themeColor="accent1" w:themeShade="BF"/>
+          <w:szCs w:val="22"/>
+          <w:bdr w:val="none" w:sz="0" w:space="0" w:color="auto" w:frame="1"/>
+        </w:rPr>
+        <w:t>aiming to define comprehensively how we proceeded to judge RCTs against the four criteria</w:t>
+      </w:r>
+      <w:r>
+        <w:rPr>
+          <w:rFonts w:ascii="Arial" w:eastAsia="Times New Roman" w:hAnsi="Arial" w:cs="Arial"/>
+          <w:i/>
+          <w:iCs/>
+          <w:color w:val="0F4761" w:themeColor="accent1" w:themeShade="BF"/>
+          <w:szCs w:val="22"/>
+          <w:bdr w:val="none" w:sz="0" w:space="0" w:color="auto" w:frame="1"/>
+        </w:rPr>
+        <w:t>, subdivid</w:t>
+      </w:r>
+      <w:r>
+        <w:rPr>
+          <w:rFonts w:ascii="Arial" w:eastAsia="Times New Roman" w:hAnsi="Arial" w:cs="Arial"/>
+          <w:i/>
+          <w:iCs/>
+          <w:color w:val="0F4761" w:themeColor="accent1" w:themeShade="BF"/>
+          <w:szCs w:val="22"/>
+          <w:bdr w:val="none" w:sz="0" w:space="0" w:color="auto" w:frame="1"/>
+        </w:rPr>
+        <w:t>ed</w:t>
+      </w:r>
+      <w:r>
+        <w:rPr>
+          <w:rFonts w:ascii="Arial" w:eastAsia="Times New Roman" w:hAnsi="Arial" w:cs="Arial"/>
+          <w:i/>
+          <w:iCs/>
+          <w:color w:val="0F4761" w:themeColor="accent1" w:themeShade="BF"/>
+          <w:szCs w:val="22"/>
+          <w:bdr w:val="none" w:sz="0" w:space="0" w:color="auto" w:frame="1"/>
+        </w:rPr>
+        <w:t xml:space="preserve">. Ultimately, we added a </w:t>
+      </w:r>
+      <w:r>
+        <w:rPr>
+          <w:rFonts w:ascii="Arial" w:eastAsia="Times New Roman" w:hAnsi="Arial" w:cs="Arial"/>
+          <w:b/>
+          <w:bCs/>
+          <w:i/>
+          <w:iCs/>
+          <w:color w:val="0F4761" w:themeColor="accent1" w:themeShade="BF"/>
+          <w:szCs w:val="22"/>
+          <w:bdr w:val="none" w:sz="0" w:space="0" w:color="auto" w:frame="1"/>
+        </w:rPr>
+        <w:t>supplemental digital content</w:t>
+      </w:r>
+      <w:r>
+        <w:rPr>
+          <w:rFonts w:ascii="Arial" w:eastAsia="Times New Roman" w:hAnsi="Arial" w:cs="Arial"/>
+          <w:i/>
+          <w:iCs/>
+          <w:color w:val="0F4761" w:themeColor="accent1" w:themeShade="BF"/>
+          <w:szCs w:val="22"/>
+          <w:bdr w:val="none" w:sz="0" w:space="0" w:color="auto" w:frame="1"/>
+        </w:rPr>
+        <w:t xml:space="preserve"> 1, which we cited before, which consists of the exhaustive list of precise decision rules applied to judge each of the five components and the four criteria in the most objective manner.</w:t>
+      </w:r>
+    </w:p>
+    <w:p>
+      <w:pPr>
+        <w:rPr>
+          <w:rFonts w:ascii="Arial" w:eastAsia="Times New Roman" w:hAnsi="Arial" w:cs="Arial"/>
+          <w:i/>
+          <w:iCs/>
+          <w:color w:val="0F4761" w:themeColor="accent1" w:themeShade="BF"/>
+          <w:szCs w:val="22"/>
+          <w:bdr w:val="none" w:sz="0" w:space="0" w:color="auto" w:frame="1"/>
+        </w:rPr>
+      </w:pPr>
+      <w:r>
+        <w:rPr>
+          <w:rFonts w:ascii="Arial" w:eastAsia="Times New Roman" w:hAnsi="Arial" w:cs="Arial"/>
+          <w:i/>
+          <w:iCs/>
+          <w:color w:val="0F4761" w:themeColor="accent1" w:themeShade="BF"/>
+          <w:szCs w:val="22"/>
+          <w:bdr w:val="none" w:sz="0" w:space="0" w:color="auto" w:frame="1"/>
+        </w:rPr>
+        <w:t xml:space="preserve">Additionally, we </w:t>
+      </w:r>
+      <w:r>
+        <w:rPr>
+          <w:rFonts w:ascii="Arial" w:eastAsia="Times New Roman" w:hAnsi="Arial" w:cs="Arial"/>
+          <w:i/>
+          <w:iCs/>
+          <w:color w:val="0F4761" w:themeColor="accent1" w:themeShade="BF"/>
+          <w:szCs w:val="22"/>
+          <w:bdr w:val="none" w:sz="0" w:space="0" w:color="auto" w:frame="1"/>
+        </w:rPr>
+        <w:t xml:space="preserve">added a paragraph in </w:t>
+      </w:r>
+      <w:r>
+        <w:rPr>
+          <w:rFonts w:ascii="Arial" w:eastAsia="Times New Roman" w:hAnsi="Arial" w:cs="Arial"/>
+          <w:b/>
+          <w:bCs/>
+          <w:i/>
+          <w:iCs/>
+          <w:color w:val="0F4761" w:themeColor="accent1" w:themeShade="BF"/>
+          <w:szCs w:val="22"/>
+          <w:bdr w:val="none" w:sz="0" w:space="0" w:color="auto" w:frame="1"/>
+        </w:rPr>
+        <w:t>Discussion</w:t>
+      </w:r>
+      <w:r>
+        <w:rPr>
+          <w:rFonts w:ascii="Arial" w:eastAsia="Times New Roman" w:hAnsi="Arial" w:cs="Arial"/>
+          <w:i/>
+          <w:iCs/>
+          <w:color w:val="0F4761" w:themeColor="accent1" w:themeShade="BF"/>
+          <w:szCs w:val="22"/>
+          <w:bdr w:val="none" w:sz="0" w:space="0" w:color="auto" w:frame="1"/>
+        </w:rPr>
+        <w:t xml:space="preserve"> section to discuss the originality of the four-point composite outcome we used as a tool to judge RCTs as able to inform clinical practice. Even though it is not yet an established tool, it may serve as a base/ reference and further refined to be used as a standardized tool for metaresearchers aiming to assess that component of RCTs clinical and clinicians to improve their potential to be clinically aligned and inform decision-making when planning and designing trials. Hithertoo, no tool has addressed this characteristic of clinical studies, and we aim to propose our tool as a first candidate to be re-used or further refined.</w:t>
+      </w:r>
+      <w:commentRangeEnd w:id="0"/>
+      <w:r>
+        <w:rPr>
+          <w:rStyle w:val="CommentReference"/>
+          <w:rFonts w:ascii="Arial" w:eastAsia="Times New Roman" w:hAnsi="Arial" w:cs="Arial"/>
+          <w:i/>
+          <w:iCs/>
+          <w:color w:val="0F4761" w:themeColor="accent1" w:themeShade="BF"/>
+          <w:sz w:val="22"/>
+          <w:szCs w:val="22"/>
+          <w:bdr w:val="none" w:sz="0" w:space="0" w:color="auto" w:frame="1"/>
+        </w:rPr>
+        <w:commentReference w:id="0"/>
       </w:r>
     </w:p>
     <w:p>
@@ -3068,6 +3380,36 @@
         <w:textAlignment w:val="baseline"/>
         <w:rPr>
           <w:rFonts w:ascii="Arial" w:eastAsia="Times New Roman" w:hAnsi="Arial" w:cs="Arial"/>
+          <w:i/>
+          <w:iCs/>
+          <w:color w:val="0F4761" w:themeColor="accent1" w:themeShade="BF"/>
+          <w:szCs w:val="22"/>
+        </w:rPr>
+      </w:pPr>
+    </w:p>
+    <w:p>
+      <w:pPr>
+        <w:textAlignment w:val="baseline"/>
+        <w:rPr>
+          <w:rFonts w:ascii="Arial" w:eastAsia="Times New Roman" w:hAnsi="Arial" w:cs="Arial"/>
+          <w:color w:val="000000"/>
+          <w:szCs w:val="22"/>
+        </w:rPr>
+      </w:pPr>
+      <w:r>
+        <w:rPr>
+          <w:rFonts w:ascii="Arial" w:eastAsia="Times New Roman" w:hAnsi="Arial" w:cs="Arial"/>
+          <w:color w:val="000000"/>
+          <w:szCs w:val="22"/>
+        </w:rPr>
+        <w:t>3. The first two major concerns are further underlined by the main study without the restriction of using CCI aiming to mitigate the bias of the pilot phase. This is naturally a good idea, but I am concerned that the systematic review of all consecutive surgical RCTs is incomplete. The authors used the Cochrane Central Register of Controlled Trials and came up with 167 consecutive surgical RCTs in 2024. The authors state that they included a "consecutive, unselected sample of surgical RCTs published in 2024", which leaves unnecessary room for interpretation. This is also not clarified by the supplementary files as there is no information about the timeline for the systematic search. The inclusion of a subgroup of studies from a 1-year period does not add as a strength of the study, why was not 2024 included as a whole year or was it? Please specifically define the inclusion period. In addition, there is a mix-up in the numbers, Figure 1 states 136, Figure 2 137, and the text 137, please revise.</w:t>
+      </w:r>
+    </w:p>
+    <w:p>
+      <w:pPr>
+        <w:textAlignment w:val="baseline"/>
+        <w:rPr>
+          <w:rFonts w:ascii="Arial" w:eastAsia="Times New Roman" w:hAnsi="Arial" w:cs="Arial"/>
           <w:color w:val="C82613"/>
           <w:szCs w:val="22"/>
         </w:rPr>
@@ -3078,17 +3420,152 @@
         <w:textAlignment w:val="baseline"/>
         <w:rPr>
           <w:rFonts w:ascii="Arial" w:eastAsia="Times New Roman" w:hAnsi="Arial" w:cs="Arial"/>
-          <w:color w:val="000000"/>
-          <w:szCs w:val="22"/>
-        </w:rPr>
-      </w:pPr>
-      <w:r>
-        <w:rPr>
-          <w:rFonts w:ascii="Arial" w:eastAsia="Times New Roman" w:hAnsi="Arial" w:cs="Arial"/>
-          <w:color w:val="000000"/>
-          <w:szCs w:val="22"/>
-        </w:rPr>
-        <w:t>2. All of the parameters included in the 4-point composite endpoint are of major importance, but the composite endpoint is not a standardized method to assess trial quality and a minor limitation in one of these parameters does not absolutely define the RCT irrelevant. In addition, the assessment of "an RCT meaningfully informing clinical practice" is very difficult as the implementation of trial results is estimated to take a median of 17 years. The first two criteria are obvious, but #4 leaves a lot of room for interpretation and no standardization was performed for this outcome assessment. This is also true for #3, i.e., assessing the feasibility and accuracy of the sample size calculation is not a simple task. In my assessment, the non-standardized composite endpoint creates a major limitation of this study, and this limitation is naturally insuperable.</w:t>
+          <w:i/>
+          <w:iCs/>
+          <w:color w:val="0F4761" w:themeColor="accent1" w:themeShade="BF"/>
+          <w:szCs w:val="22"/>
+          <w:bdr w:val="none" w:sz="0" w:space="0" w:color="auto" w:frame="1"/>
+        </w:rPr>
+      </w:pPr>
+      <w:r>
+        <w:rPr>
+          <w:rFonts w:ascii="Arial" w:hAnsi="Arial" w:cs="Arial"/>
+          <w:i/>
+          <w:iCs/>
+          <w:color w:val="0F4761" w:themeColor="accent1" w:themeShade="BF"/>
+          <w:u w:val="single"/>
+        </w:rPr>
+        <w:t>Answer</w:t>
+      </w:r>
+      <w:r>
+        <w:rPr>
+          <w:rFonts w:ascii="Arial" w:hAnsi="Arial" w:cs="Arial"/>
+          <w:i/>
+          <w:iCs/>
+          <w:color w:val="0F4761" w:themeColor="accent1" w:themeShade="BF"/>
+        </w:rPr>
+        <w:t>: We thank the reviewer for</w:t>
+      </w:r>
+      <w:r>
+        <w:rPr>
+          <w:rFonts w:ascii="Arial" w:hAnsi="Arial" w:cs="Arial"/>
+          <w:i/>
+          <w:iCs/>
+          <w:color w:val="0F4761" w:themeColor="accent1" w:themeShade="BF"/>
+        </w:rPr>
+        <w:t xml:space="preserve"> underscoring this area of unclarity in the detail of our methodological approach. We detailed the </w:t>
+      </w:r>
+      <w:r>
+        <w:rPr>
+          <w:rFonts w:ascii="Arial" w:eastAsia="Times New Roman" w:hAnsi="Arial" w:cs="Arial"/>
+          <w:i/>
+          <w:iCs/>
+          <w:color w:val="0F4761" w:themeColor="accent1" w:themeShade="BF"/>
+          <w:szCs w:val="22"/>
+          <w:bdr w:val="none" w:sz="0" w:space="0" w:color="auto" w:frame="1"/>
+        </w:rPr>
+        <w:t>screening and selection process</w:t>
+      </w:r>
+      <w:r>
+        <w:rPr>
+          <w:rFonts w:ascii="Arial" w:eastAsia="Times New Roman" w:hAnsi="Arial" w:cs="Arial"/>
+          <w:i/>
+          <w:iCs/>
+          <w:color w:val="0F4761" w:themeColor="accent1" w:themeShade="BF"/>
+          <w:szCs w:val="22"/>
+          <w:bdr w:val="none" w:sz="0" w:space="0" w:color="auto" w:frame="1"/>
+        </w:rPr>
+        <w:t xml:space="preserve"> for our main phase of the study in </w:t>
+      </w:r>
+      <w:r>
+        <w:rPr>
+          <w:rFonts w:ascii="Arial" w:eastAsia="Times New Roman" w:hAnsi="Arial" w:cs="Arial"/>
+          <w:b/>
+          <w:bCs/>
+          <w:i/>
+          <w:iCs/>
+          <w:color w:val="0F4761" w:themeColor="accent1" w:themeShade="BF"/>
+          <w:szCs w:val="22"/>
+          <w:bdr w:val="none" w:sz="0" w:space="0" w:color="auto" w:frame="1"/>
+        </w:rPr>
+        <w:t>Methods</w:t>
+      </w:r>
+      <w:r>
+        <w:rPr>
+          <w:rFonts w:ascii="Arial" w:eastAsia="Times New Roman" w:hAnsi="Arial" w:cs="Arial"/>
+          <w:i/>
+          <w:iCs/>
+          <w:color w:val="0F4761" w:themeColor="accent1" w:themeShade="BF"/>
+          <w:szCs w:val="22"/>
+          <w:bdr w:val="none" w:sz="0" w:space="0" w:color="auto" w:frame="1"/>
+        </w:rPr>
+        <w:t xml:space="preserve">. </w:t>
+      </w:r>
+      <w:r>
+        <w:rPr>
+          <w:rFonts w:ascii="Arial" w:eastAsia="Times New Roman" w:hAnsi="Arial" w:cs="Arial"/>
+          <w:i/>
+          <w:iCs/>
+          <w:color w:val="0F4761" w:themeColor="accent1" w:themeShade="BF"/>
+          <w:szCs w:val="22"/>
+          <w:bdr w:val="none" w:sz="0" w:space="0" w:color="auto" w:frame="1"/>
+        </w:rPr>
+        <w:t xml:space="preserve">Additionally, we added the </w:t>
+      </w:r>
+      <w:r>
+        <w:rPr>
+          <w:rFonts w:ascii="Arial" w:eastAsia="Times New Roman" w:hAnsi="Arial" w:cs="Arial"/>
+          <w:i/>
+          <w:iCs/>
+          <w:color w:val="0F4761" w:themeColor="accent1" w:themeShade="BF"/>
+          <w:szCs w:val="22"/>
+          <w:bdr w:val="none" w:sz="0" w:space="0" w:color="auto" w:frame="1"/>
+        </w:rPr>
+        <w:t>complete</w:t>
+      </w:r>
+      <w:r>
+        <w:rPr>
+          <w:rFonts w:ascii="Arial" w:eastAsia="Times New Roman" w:hAnsi="Arial" w:cs="Arial"/>
+          <w:i/>
+          <w:iCs/>
+          <w:color w:val="0F4761" w:themeColor="accent1" w:themeShade="BF"/>
+          <w:szCs w:val="22"/>
+          <w:bdr w:val="none" w:sz="0" w:space="0" w:color="auto" w:frame="1"/>
+        </w:rPr>
+        <w:t xml:space="preserve"> reference to the</w:t>
+      </w:r>
+      <w:r>
+        <w:rPr>
+          <w:rFonts w:ascii="Arial" w:eastAsia="Times New Roman" w:hAnsi="Arial" w:cs="Arial"/>
+          <w:i/>
+          <w:iCs/>
+          <w:color w:val="0F4761" w:themeColor="accent1" w:themeShade="BF"/>
+          <w:szCs w:val="22"/>
+          <w:bdr w:val="none" w:sz="0" w:space="0" w:color="auto" w:frame="1"/>
+        </w:rPr>
+        <w:t xml:space="preserve"> public</w:t>
+      </w:r>
+      <w:r>
+        <w:rPr>
+          <w:rFonts w:ascii="Arial" w:eastAsia="Times New Roman" w:hAnsi="Arial" w:cs="Arial"/>
+          <w:i/>
+          <w:iCs/>
+          <w:color w:val="0F4761" w:themeColor="accent1" w:themeShade="BF"/>
+          <w:szCs w:val="22"/>
+          <w:bdr w:val="none" w:sz="0" w:space="0" w:color="auto" w:frame="1"/>
+        </w:rPr>
+        <w:t xml:space="preserve"> OSF pre-registration, where our protocol is </w:t>
+      </w:r>
+      <w:r>
+        <w:rPr>
+          <w:rFonts w:ascii="Arial" w:eastAsia="Times New Roman" w:hAnsi="Arial" w:cs="Arial"/>
+          <w:i/>
+          <w:iCs/>
+          <w:color w:val="0F4761" w:themeColor="accent1" w:themeShade="BF"/>
+          <w:szCs w:val="22"/>
+          <w:bdr w:val="none" w:sz="0" w:space="0" w:color="auto" w:frame="1"/>
+        </w:rPr>
+        <w:t xml:space="preserve">also publicly accessible. </w:t>
       </w:r>
     </w:p>
     <w:p>
@@ -3096,197 +3573,167 @@
         <w:textAlignment w:val="baseline"/>
         <w:rPr>
           <w:rFonts w:ascii="Arial" w:eastAsia="Times New Roman" w:hAnsi="Arial" w:cs="Arial"/>
-          <w:color w:val="C82613"/>
-          <w:szCs w:val="22"/>
-        </w:rPr>
-      </w:pPr>
-    </w:p>
-    <w:p>
-      <w:pPr>
-        <w:rPr>
-          <w:rFonts w:ascii="Arial" w:eastAsia="Times New Roman" w:hAnsi="Arial" w:cs="Arial"/>
-          <w:i/>
-          <w:iCs/>
-          <w:color w:val="0F4761" w:themeColor="accent1" w:themeShade="BF"/>
-          <w:szCs w:val="22"/>
-          <w:bdr w:val="none" w:sz="0" w:space="0" w:color="auto" w:frame="1"/>
-        </w:rPr>
-      </w:pPr>
-      <w:commentRangeStart w:id="0"/>
-      <w:r>
-        <w:rPr>
-          <w:rFonts w:ascii="Arial" w:hAnsi="Arial" w:cs="Arial"/>
-          <w:i/>
-          <w:iCs/>
-          <w:color w:val="0F4761" w:themeColor="accent1" w:themeShade="BF"/>
-          <w:u w:val="single"/>
-        </w:rPr>
-        <w:t>Answer</w:t>
-      </w:r>
-      <w:r>
-        <w:rPr>
-          <w:rFonts w:ascii="Arial" w:hAnsi="Arial" w:cs="Arial"/>
-          <w:i/>
-          <w:iCs/>
-          <w:color w:val="0F4761" w:themeColor="accent1" w:themeShade="BF"/>
-        </w:rPr>
-        <w:t>: We thank the reviewer for</w:t>
-      </w:r>
-      <w:r>
-        <w:rPr>
-          <w:rFonts w:ascii="Arial" w:hAnsi="Arial" w:cs="Arial"/>
-          <w:i/>
-          <w:iCs/>
-          <w:color w:val="0F4761" w:themeColor="accent1" w:themeShade="BF"/>
-        </w:rPr>
-        <w:t xml:space="preserve"> unerlining the limits of our composite outcome and pointing out an area of improving the way we defined it. Besides citing and providing the complete reference of our protocol (doi and publicly available in OSF platform), we added </w:t>
-      </w:r>
-      <w:r>
-        <w:t>in</w:t>
-      </w:r>
-      <w:r>
-        <w:rPr>
-          <w:rFonts w:ascii="Arial" w:eastAsia="Times New Roman" w:hAnsi="Arial" w:cs="Arial"/>
-          <w:b/>
-          <w:bCs/>
-          <w:i/>
-          <w:iCs/>
-          <w:color w:val="0F4761" w:themeColor="accent1" w:themeShade="BF"/>
-          <w:szCs w:val="22"/>
-          <w:bdr w:val="none" w:sz="0" w:space="0" w:color="auto" w:frame="1"/>
-        </w:rPr>
-        <w:t xml:space="preserve"> </w:t>
-      </w:r>
-      <w:r>
-        <w:rPr>
-          <w:rFonts w:ascii="Arial" w:eastAsia="Times New Roman" w:hAnsi="Arial" w:cs="Arial"/>
-          <w:b/>
-          <w:bCs/>
-          <w:i/>
-          <w:iCs/>
-          <w:color w:val="0F4761" w:themeColor="accent1" w:themeShade="BF"/>
-          <w:szCs w:val="22"/>
-          <w:bdr w:val="none" w:sz="0" w:space="0" w:color="auto" w:frame="1"/>
-        </w:rPr>
-        <w:t>Methods </w:t>
-      </w:r>
-      <w:r>
-        <w:rPr>
-          <w:rFonts w:ascii="Arial" w:eastAsia="Times New Roman" w:hAnsi="Arial" w:cs="Arial"/>
-          <w:i/>
-          <w:iCs/>
-          <w:color w:val="0F4761" w:themeColor="accent1" w:themeShade="BF"/>
-          <w:szCs w:val="22"/>
-          <w:bdr w:val="none" w:sz="0" w:space="0" w:color="auto" w:frame="1"/>
-        </w:rPr>
-        <w:t xml:space="preserve">section </w:t>
-      </w:r>
-      <w:r>
-        <w:rPr>
-          <w:rFonts w:ascii="Arial" w:eastAsia="Times New Roman" w:hAnsi="Arial" w:cs="Arial"/>
-          <w:i/>
-          <w:iCs/>
-          <w:color w:val="0F4761" w:themeColor="accent1" w:themeShade="BF"/>
-          <w:szCs w:val="22"/>
-          <w:bdr w:val="none" w:sz="0" w:space="0" w:color="auto" w:frame="1"/>
-        </w:rPr>
-        <w:t xml:space="preserve">the subsection </w:t>
-      </w:r>
-      <w:r>
-        <w:rPr>
-          <w:rFonts w:ascii="Arial" w:eastAsia="Times New Roman" w:hAnsi="Arial" w:cs="Arial"/>
-          <w:b/>
-          <w:bCs/>
-          <w:i/>
-          <w:iCs/>
-          <w:color w:val="0F4761" w:themeColor="accent1" w:themeShade="BF"/>
-          <w:szCs w:val="22"/>
-          <w:bdr w:val="none" w:sz="0" w:space="0" w:color="auto" w:frame="1"/>
-        </w:rPr>
-        <w:t>Outcomes definition</w:t>
-      </w:r>
-      <w:r>
-        <w:rPr>
-          <w:rFonts w:ascii="Arial" w:eastAsia="Times New Roman" w:hAnsi="Arial" w:cs="Arial"/>
-          <w:i/>
-          <w:iCs/>
-          <w:color w:val="0F4761" w:themeColor="accent1" w:themeShade="BF"/>
-          <w:szCs w:val="22"/>
-          <w:bdr w:val="none" w:sz="0" w:space="0" w:color="auto" w:frame="1"/>
-        </w:rPr>
-        <w:t xml:space="preserve">, subdivided into four paragraphs to define each of the four criteria. </w:t>
-      </w:r>
-    </w:p>
-    <w:p>
-      <w:pPr>
-        <w:rPr>
-          <w:rFonts w:ascii="Arial" w:eastAsia="Times New Roman" w:hAnsi="Arial" w:cs="Arial"/>
-          <w:i/>
-          <w:iCs/>
-          <w:color w:val="0F4761" w:themeColor="accent1" w:themeShade="BF"/>
-          <w:szCs w:val="22"/>
-          <w:bdr w:val="none" w:sz="0" w:space="0" w:color="auto" w:frame="1"/>
-        </w:rPr>
-      </w:pPr>
-      <w:r>
-        <w:rPr>
-          <w:rFonts w:ascii="Arial" w:eastAsia="Times New Roman" w:hAnsi="Arial" w:cs="Arial"/>
-          <w:i/>
-          <w:iCs/>
-          <w:color w:val="0F4761" w:themeColor="accent1" w:themeShade="BF"/>
-          <w:szCs w:val="22"/>
-          <w:bdr w:val="none" w:sz="0" w:space="0" w:color="auto" w:frame="1"/>
-        </w:rPr>
-        <w:t xml:space="preserve">Additionally, we </w:t>
-      </w:r>
-      <w:r>
-        <w:rPr>
-          <w:rFonts w:ascii="Arial" w:eastAsia="Times New Roman" w:hAnsi="Arial" w:cs="Arial"/>
-          <w:i/>
-          <w:iCs/>
-          <w:color w:val="0F4761" w:themeColor="accent1" w:themeShade="BF"/>
-          <w:szCs w:val="22"/>
-          <w:bdr w:val="none" w:sz="0" w:space="0" w:color="auto" w:frame="1"/>
-        </w:rPr>
-        <w:t xml:space="preserve">added a paragraph in </w:t>
-      </w:r>
-      <w:r>
-        <w:rPr>
-          <w:rFonts w:ascii="Arial" w:eastAsia="Times New Roman" w:hAnsi="Arial" w:cs="Arial"/>
-          <w:b/>
-          <w:bCs/>
-          <w:i/>
-          <w:iCs/>
-          <w:color w:val="0F4761" w:themeColor="accent1" w:themeShade="BF"/>
-          <w:szCs w:val="22"/>
-          <w:bdr w:val="none" w:sz="0" w:space="0" w:color="auto" w:frame="1"/>
-        </w:rPr>
-        <w:t>Discussion</w:t>
-      </w:r>
-      <w:r>
-        <w:rPr>
-          <w:rFonts w:ascii="Arial" w:eastAsia="Times New Roman" w:hAnsi="Arial" w:cs="Arial"/>
-          <w:i/>
-          <w:iCs/>
-          <w:color w:val="0F4761" w:themeColor="accent1" w:themeShade="BF"/>
-          <w:szCs w:val="22"/>
-          <w:bdr w:val="none" w:sz="0" w:space="0" w:color="auto" w:frame="1"/>
-        </w:rPr>
-        <w:t xml:space="preserve"> section to discuss the originality of the four-point composite outcome we used as a tool to judge RCTs as able to inform clinical practice. Even though it is not yet an established tool, it may serve as a base/ reference and further refined to be used as a standardized tool for metaresearchers aiming to assess that component of RCTs clinical and clinicians to improve their potential to be clinically aligned and inform decision-making when planning and designing trials. Hithertoo, no tool has addressed this characteristic of clinical studies, and we aim to propose our tool as a first candidate to be re-used or further refined.</w:t>
-      </w:r>
-      <w:commentRangeEnd w:id="0"/>
-      <w:r>
-        <w:rPr>
-          <w:rStyle w:val="CommentReference"/>
-          <w:rFonts w:ascii="Arial" w:eastAsia="Times New Roman" w:hAnsi="Arial" w:cs="Arial"/>
-          <w:i/>
-          <w:iCs/>
-          <w:color w:val="0F4761" w:themeColor="accent1" w:themeShade="BF"/>
-          <w:sz w:val="22"/>
-          <w:szCs w:val="22"/>
-          <w:bdr w:val="none" w:sz="0" w:space="0" w:color="auto" w:frame="1"/>
-        </w:rPr>
-        <w:commentReference w:id="0"/>
+          <w:i/>
+          <w:iCs/>
+          <w:color w:val="0F4761" w:themeColor="accent1" w:themeShade="BF"/>
+          <w:szCs w:val="22"/>
+          <w:bdr w:val="none" w:sz="0" w:space="0" w:color="auto" w:frame="1"/>
+        </w:rPr>
+      </w:pPr>
+      <w:r>
+        <w:rPr>
+          <w:rFonts w:ascii="Arial" w:eastAsia="Times New Roman" w:hAnsi="Arial" w:cs="Arial"/>
+          <w:i/>
+          <w:iCs/>
+          <w:color w:val="0F4761" w:themeColor="accent1" w:themeShade="BF"/>
+          <w:szCs w:val="22"/>
+          <w:bdr w:val="none" w:sz="0" w:space="0" w:color="auto" w:frame="1"/>
+        </w:rPr>
+        <w:t xml:space="preserve">Finally, we thoroughly looked for 137 to address the last part of your last comment; however, we never did report such a number. We had reported 136 studies for the </w:t>
+      </w:r>
+      <w:r>
+        <w:rPr>
+          <w:rFonts w:ascii="Arial" w:eastAsia="Times New Roman" w:hAnsi="Arial" w:cs="Arial"/>
+          <w:b/>
+          <w:bCs/>
+          <w:i/>
+          <w:iCs/>
+          <w:color w:val="0F4761" w:themeColor="accent1" w:themeShade="BF"/>
+          <w:szCs w:val="22"/>
+          <w:bdr w:val="none" w:sz="0" w:space="0" w:color="auto" w:frame="1"/>
+        </w:rPr>
+        <w:t>pilot</w:t>
+      </w:r>
+      <w:r>
+        <w:rPr>
+          <w:rFonts w:ascii="Arial" w:eastAsia="Times New Roman" w:hAnsi="Arial" w:cs="Arial"/>
+          <w:i/>
+          <w:iCs/>
+          <w:color w:val="0F4761" w:themeColor="accent1" w:themeShade="BF"/>
+          <w:szCs w:val="22"/>
+          <w:bdr w:val="none" w:sz="0" w:space="0" w:color="auto" w:frame="1"/>
+        </w:rPr>
+        <w:t xml:space="preserve"> phase (</w:t>
+      </w:r>
+      <w:r>
+        <w:rPr>
+          <w:rFonts w:ascii="Arial" w:eastAsia="Times New Roman" w:hAnsi="Arial" w:cs="Arial"/>
+          <w:b/>
+          <w:bCs/>
+          <w:i/>
+          <w:iCs/>
+          <w:color w:val="0F4761" w:themeColor="accent1" w:themeShade="BF"/>
+          <w:szCs w:val="22"/>
+          <w:bdr w:val="none" w:sz="0" w:space="0" w:color="auto" w:frame="1"/>
+        </w:rPr>
+        <w:t>figure 1</w:t>
+      </w:r>
+      <w:r>
+        <w:rPr>
+          <w:rFonts w:ascii="Arial" w:eastAsia="Times New Roman" w:hAnsi="Arial" w:cs="Arial"/>
+          <w:i/>
+          <w:iCs/>
+          <w:color w:val="0F4761" w:themeColor="accent1" w:themeShade="BF"/>
+          <w:szCs w:val="22"/>
+          <w:bdr w:val="none" w:sz="0" w:space="0" w:color="auto" w:frame="1"/>
+        </w:rPr>
+        <w:t xml:space="preserve"> and </w:t>
+      </w:r>
+      <w:r>
+        <w:rPr>
+          <w:rFonts w:ascii="Arial" w:eastAsia="Times New Roman" w:hAnsi="Arial" w:cs="Arial"/>
+          <w:b/>
+          <w:bCs/>
+          <w:i/>
+          <w:iCs/>
+          <w:color w:val="0F4761" w:themeColor="accent1" w:themeShade="BF"/>
+          <w:szCs w:val="22"/>
+          <w:bdr w:val="none" w:sz="0" w:space="0" w:color="auto" w:frame="1"/>
+        </w:rPr>
+        <w:t>Results</w:t>
+      </w:r>
+      <w:r>
+        <w:rPr>
+          <w:rFonts w:ascii="Arial" w:eastAsia="Times New Roman" w:hAnsi="Arial" w:cs="Arial"/>
+          <w:i/>
+          <w:iCs/>
+          <w:color w:val="0F4761" w:themeColor="accent1" w:themeShade="BF"/>
+          <w:szCs w:val="22"/>
+          <w:bdr w:val="none" w:sz="0" w:space="0" w:color="auto" w:frame="1"/>
+        </w:rPr>
+        <w:t xml:space="preserve"> section for pilot study) and then 176 for </w:t>
+      </w:r>
+      <w:r>
+        <w:rPr>
+          <w:rFonts w:ascii="Arial" w:eastAsia="Times New Roman" w:hAnsi="Arial" w:cs="Arial"/>
+          <w:b/>
+          <w:bCs/>
+          <w:i/>
+          <w:iCs/>
+          <w:color w:val="0F4761" w:themeColor="accent1" w:themeShade="BF"/>
+          <w:szCs w:val="22"/>
+          <w:bdr w:val="none" w:sz="0" w:space="0" w:color="auto" w:frame="1"/>
+        </w:rPr>
+        <w:t>main</w:t>
+      </w:r>
+      <w:r>
+        <w:rPr>
+          <w:rFonts w:ascii="Arial" w:eastAsia="Times New Roman" w:hAnsi="Arial" w:cs="Arial"/>
+          <w:i/>
+          <w:iCs/>
+          <w:color w:val="0F4761" w:themeColor="accent1" w:themeShade="BF"/>
+          <w:szCs w:val="22"/>
+          <w:bdr w:val="none" w:sz="0" w:space="0" w:color="auto" w:frame="1"/>
+        </w:rPr>
+        <w:t xml:space="preserve"> study phase (</w:t>
+      </w:r>
+      <w:r>
+        <w:rPr>
+          <w:rFonts w:ascii="Arial" w:eastAsia="Times New Roman" w:hAnsi="Arial" w:cs="Arial"/>
+          <w:b/>
+          <w:bCs/>
+          <w:i/>
+          <w:iCs/>
+          <w:color w:val="0F4761" w:themeColor="accent1" w:themeShade="BF"/>
+          <w:szCs w:val="22"/>
+          <w:bdr w:val="none" w:sz="0" w:space="0" w:color="auto" w:frame="1"/>
+        </w:rPr>
+        <w:t>Results</w:t>
+      </w:r>
+      <w:r>
+        <w:rPr>
+          <w:rFonts w:ascii="Arial" w:eastAsia="Times New Roman" w:hAnsi="Arial" w:cs="Arial"/>
+          <w:i/>
+          <w:iCs/>
+          <w:color w:val="0F4761" w:themeColor="accent1" w:themeShade="BF"/>
+          <w:szCs w:val="22"/>
+          <w:bdr w:val="none" w:sz="0" w:space="0" w:color="auto" w:frame="1"/>
+        </w:rPr>
+        <w:t xml:space="preserve"> section for main study and </w:t>
+      </w:r>
+      <w:r>
+        <w:rPr>
+          <w:rFonts w:ascii="Arial" w:eastAsia="Times New Roman" w:hAnsi="Arial" w:cs="Arial"/>
+          <w:b/>
+          <w:bCs/>
+          <w:i/>
+          <w:iCs/>
+          <w:color w:val="0F4761" w:themeColor="accent1" w:themeShade="BF"/>
+          <w:szCs w:val="22"/>
+          <w:bdr w:val="none" w:sz="0" w:space="0" w:color="auto" w:frame="1"/>
+        </w:rPr>
+        <w:t>figure 2</w:t>
+      </w:r>
+      <w:r>
+        <w:rPr>
+          <w:rFonts w:ascii="Arial" w:eastAsia="Times New Roman" w:hAnsi="Arial" w:cs="Arial"/>
+          <w:i/>
+          <w:iCs/>
+          <w:color w:val="0F4761" w:themeColor="accent1" w:themeShade="BF"/>
+          <w:szCs w:val="22"/>
+          <w:bdr w:val="none" w:sz="0" w:space="0" w:color="auto" w:frame="1"/>
+        </w:rPr>
+        <w:t xml:space="preserve">). </w:t>
       </w:r>
     </w:p>
     <w:p>
@@ -3298,42 +3745,84 @@
           <w:iCs/>
           <w:color w:val="0F4761" w:themeColor="accent1" w:themeShade="BF"/>
           <w:szCs w:val="22"/>
-        </w:rPr>
-      </w:pPr>
+          <w:bdr w:val="none" w:sz="0" w:space="0" w:color="auto" w:frame="1"/>
+        </w:rPr>
+      </w:pPr>
+    </w:p>
+    <w:p>
+      <w:pPr>
+        <w:rPr>
+          <w:rFonts w:ascii="Arial" w:hAnsi="Arial" w:cs="Arial"/>
+          <w:i/>
+          <w:iCs/>
+          <w:color w:val="0F4761" w:themeColor="accent1" w:themeShade="BF"/>
+        </w:rPr>
+      </w:pPr>
+      <w:r>
+        <w:rPr>
+          <w:rFonts w:ascii="Arial" w:hAnsi="Arial" w:cs="Arial"/>
+          <w:i/>
+          <w:iCs/>
+          <w:color w:val="0F4761" w:themeColor="accent1" w:themeShade="BF"/>
+        </w:rPr>
+        <w:t xml:space="preserve">Extracted from </w:t>
+      </w:r>
+      <w:r>
+        <w:rPr>
+          <w:rFonts w:ascii="Arial" w:eastAsia="Times New Roman" w:hAnsi="Arial" w:cs="Arial"/>
+          <w:b/>
+          <w:bCs/>
+          <w:i/>
+          <w:iCs/>
+          <w:color w:val="0F4761" w:themeColor="accent1" w:themeShade="BF"/>
+          <w:szCs w:val="22"/>
+          <w:bdr w:val="none" w:sz="0" w:space="0" w:color="auto" w:frame="1"/>
+        </w:rPr>
+        <w:t>Methods</w:t>
+      </w:r>
+      <w:r>
+        <w:rPr>
+          <w:rFonts w:ascii="Arial" w:hAnsi="Arial" w:cs="Arial"/>
+          <w:b/>
+          <w:bCs/>
+          <w:i/>
+          <w:iCs/>
+          <w:color w:val="0F4761" w:themeColor="accent1" w:themeShade="BF"/>
+        </w:rPr>
+        <w:t xml:space="preserve"> (page)</w:t>
+      </w:r>
+      <w:r>
+        <w:rPr>
+          <w:rFonts w:ascii="Arial" w:hAnsi="Arial" w:cs="Arial"/>
+          <w:b/>
+          <w:bCs/>
+          <w:i/>
+          <w:iCs/>
+          <w:color w:val="0F4761" w:themeColor="accent1" w:themeShade="BF"/>
+        </w:rPr>
+        <w:t>:</w:t>
+      </w:r>
     </w:p>
     <w:p>
       <w:pPr>
         <w:textAlignment w:val="baseline"/>
         <w:rPr>
           <w:rFonts w:ascii="Arial" w:eastAsia="Times New Roman" w:hAnsi="Arial" w:cs="Arial"/>
-          <w:color w:val="000000"/>
-          <w:szCs w:val="22"/>
-        </w:rPr>
-      </w:pPr>
-      <w:r>
-        <w:rPr>
-          <w:rFonts w:ascii="Arial" w:eastAsia="Times New Roman" w:hAnsi="Arial" w:cs="Arial"/>
-          <w:color w:val="000000"/>
-          <w:szCs w:val="22"/>
-        </w:rPr>
-        <w:t xml:space="preserve">3. The first two major concerns are further underlined by the main study without the restriction of using CCI aiming to mitigate the bias of the pilot phase. This is naturally a good idea, but I am concerned that the systematic review of all consecutive surgical RCTs is incomplete. The authors used the Cochrane Central Register of Controlled Trials and came up with 167 consecutive surgical RCTs in 2024. The authors state that they included a "consecutive, unselected sample of surgical RCTs published in 2024", which leaves unnecessary room for interpretation. This is also not clarified by the supplementary files as there is no information about the timeline for the systematic search. The inclusion of a subgroup of studies from a 1-year period does not add as a strength of the study, why was not 2024 included as a whole year or was it? </w:t>
-      </w:r>
-      <w:r>
-        <w:rPr>
-          <w:rFonts w:ascii="Arial" w:eastAsia="Times New Roman" w:hAnsi="Arial" w:cs="Arial"/>
-          <w:color w:val="000000"/>
-          <w:szCs w:val="22"/>
-        </w:rPr>
-        <w:lastRenderedPageBreak/>
-        <w:t>Please specifically define the inclusion period. In addition, there is a mix-up in the numbers, Figure 1 states 136, Figure 2 137, and the text 137, please revise.</w:t>
-      </w:r>
+          <w:i/>
+          <w:iCs/>
+          <w:color w:val="0F4761" w:themeColor="accent1" w:themeShade="BF"/>
+          <w:szCs w:val="22"/>
+        </w:rPr>
+      </w:pPr>
     </w:p>
     <w:p>
       <w:pPr>
         <w:textAlignment w:val="baseline"/>
         <w:rPr>
           <w:rFonts w:ascii="Arial" w:eastAsia="Times New Roman" w:hAnsi="Arial" w:cs="Arial"/>
-          <w:color w:val="C82613"/>
+          <w:i/>
+          <w:iCs/>
+          <w:color w:val="0F4761" w:themeColor="accent1" w:themeShade="BF"/>
           <w:szCs w:val="22"/>
         </w:rPr>
       </w:pPr>
@@ -3351,22 +3840,35 @@
       </w:pPr>
       <w:r>
         <w:rPr>
-          <w:rFonts w:ascii="Arial" w:hAnsi="Arial" w:cs="Arial"/>
-          <w:i/>
-          <w:iCs/>
-          <w:color w:val="0F4761" w:themeColor="accent1" w:themeShade="BF"/>
-          <w:u w:val="single"/>
-        </w:rPr>
-        <w:t>Answer</w:t>
-      </w:r>
-      <w:r>
-        <w:rPr>
-          <w:rFonts w:ascii="Arial" w:hAnsi="Arial" w:cs="Arial"/>
-          <w:i/>
-          <w:iCs/>
-          <w:color w:val="0F4761" w:themeColor="accent1" w:themeShade="BF"/>
-        </w:rPr>
-        <w:t>: We thank the reviewer for</w:t>
+          <w:rFonts w:ascii="Arial" w:eastAsia="Times New Roman" w:hAnsi="Arial" w:cs="Arial"/>
+          <w:i/>
+          <w:iCs/>
+          <w:color w:val="0F4761" w:themeColor="accent1" w:themeShade="BF"/>
+          <w:szCs w:val="22"/>
+        </w:rPr>
+        <w:t xml:space="preserve">Extracted from </w:t>
+      </w:r>
+      <w:r>
+        <w:rPr>
+          <w:rFonts w:ascii="Arial" w:eastAsia="Times New Roman" w:hAnsi="Arial" w:cs="Arial"/>
+          <w:b/>
+          <w:bCs/>
+          <w:i/>
+          <w:iCs/>
+          <w:color w:val="0F4761" w:themeColor="accent1" w:themeShade="BF"/>
+          <w:szCs w:val="22"/>
+        </w:rPr>
+        <w:t>References</w:t>
+      </w:r>
+      <w:r>
+        <w:rPr>
+          <w:rFonts w:ascii="Arial" w:eastAsia="Times New Roman" w:hAnsi="Arial" w:cs="Arial"/>
+          <w:i/>
+          <w:iCs/>
+          <w:color w:val="0F4761" w:themeColor="accent1" w:themeShade="BF"/>
+          <w:szCs w:val="22"/>
+        </w:rPr>
+        <w:t>:</w:t>
       </w:r>
     </w:p>
     <w:p>
@@ -3378,93 +3880,19 @@
           <w:iCs/>
           <w:color w:val="0F4761" w:themeColor="accent1" w:themeShade="BF"/>
           <w:szCs w:val="22"/>
-          <w:bdr w:val="none" w:sz="0" w:space="0" w:color="auto" w:frame="1"/>
-        </w:rPr>
-      </w:pPr>
-      <w:r>
-        <w:rPr>
-          <w:rFonts w:ascii="Arial" w:eastAsia="Times New Roman" w:hAnsi="Arial" w:cs="Arial"/>
-          <w:b/>
-          <w:bCs/>
-          <w:i/>
-          <w:iCs/>
-          <w:color w:val="0F4761" w:themeColor="accent1" w:themeShade="BF"/>
-          <w:szCs w:val="22"/>
-          <w:bdr w:val="none" w:sz="0" w:space="0" w:color="auto" w:frame="1"/>
-        </w:rPr>
-        <w:t>Revisions to adopt: As for reviewer *1, </w:t>
-      </w:r>
-      <w:r>
-        <w:rPr>
-          <w:rFonts w:ascii="Arial" w:eastAsia="Times New Roman" w:hAnsi="Arial" w:cs="Arial"/>
-          <w:i/>
-          <w:iCs/>
-          <w:color w:val="0F4761" w:themeColor="accent1" w:themeShade="BF"/>
-          <w:szCs w:val="22"/>
-          <w:bdr w:val="none" w:sz="0" w:space="0" w:color="auto" w:frame="1"/>
-        </w:rPr>
-        <w:t>we will expand more in the </w:t>
-      </w:r>
-      <w:r>
-        <w:rPr>
-          <w:rFonts w:ascii="Arial" w:eastAsia="Times New Roman" w:hAnsi="Arial" w:cs="Arial"/>
-          <w:b/>
-          <w:bCs/>
-          <w:i/>
-          <w:iCs/>
-          <w:color w:val="0F4761" w:themeColor="accent1" w:themeShade="BF"/>
-          <w:szCs w:val="22"/>
-          <w:bdr w:val="none" w:sz="0" w:space="0" w:color="auto" w:frame="1"/>
-        </w:rPr>
-        <w:t>Methods </w:t>
-      </w:r>
-      <w:r>
-        <w:rPr>
-          <w:rFonts w:ascii="Arial" w:eastAsia="Times New Roman" w:hAnsi="Arial" w:cs="Arial"/>
-          <w:i/>
-          <w:iCs/>
-          <w:color w:val="0F4761" w:themeColor="accent1" w:themeShade="BF"/>
-          <w:szCs w:val="22"/>
-          <w:bdr w:val="none" w:sz="0" w:space="0" w:color="auto" w:frame="1"/>
-        </w:rPr>
-        <w:t>section that part of studies screening and selection process. And adjust the mistake as well. --&gt; agree</w:t>
-      </w:r>
-    </w:p>
-    <w:p>
-      <w:pPr>
-        <w:textAlignment w:val="baseline"/>
-        <w:rPr>
-          <w:rFonts w:ascii="Arial" w:eastAsia="Times New Roman" w:hAnsi="Arial" w:cs="Arial"/>
-          <w:i/>
-          <w:iCs/>
-          <w:color w:val="0F4761" w:themeColor="accent1" w:themeShade="BF"/>
-          <w:szCs w:val="22"/>
-          <w:bdr w:val="none" w:sz="0" w:space="0" w:color="auto" w:frame="1"/>
-        </w:rPr>
-      </w:pPr>
-      <w:r>
-        <w:rPr>
-          <w:rFonts w:ascii="Arial" w:eastAsia="Times New Roman" w:hAnsi="Arial" w:cs="Arial"/>
-          <w:i/>
-          <w:iCs/>
-          <w:color w:val="0F4761" w:themeColor="accent1" w:themeShade="BF"/>
-          <w:szCs w:val="22"/>
-          <w:bdr w:val="none" w:sz="0" w:space="0" w:color="auto" w:frame="1"/>
-        </w:rPr>
-        <w:t xml:space="preserve">Additionally, we added the doi reference to the OSF pre-registration, where our protocol is </w:t>
-      </w:r>
-    </w:p>
-    <w:p>
-      <w:pPr>
-        <w:textAlignment w:val="baseline"/>
-        <w:rPr>
-          <w:rFonts w:ascii="Arial" w:eastAsia="Times New Roman" w:hAnsi="Arial" w:cs="Arial"/>
-          <w:i/>
-          <w:iCs/>
-          <w:color w:val="0F4761" w:themeColor="accent1" w:themeShade="BF"/>
-          <w:szCs w:val="22"/>
-        </w:rPr>
-      </w:pPr>
+        </w:rPr>
+      </w:pPr>
+      <w:r>
+        <w:rPr>
+          <w:rFonts w:ascii="Arial" w:eastAsia="Times New Roman" w:hAnsi="Arial" w:cs="Arial"/>
+          <w:i/>
+          <w:iCs/>
+          <w:color w:val="0F4761" w:themeColor="accent1" w:themeShade="BF"/>
+          <w:szCs w:val="22"/>
+          <w:highlight w:val="yellow"/>
+        </w:rPr>
+        <w:t>Rodrigues Ribeiro J, Puhan M, Abbassi F, et al. Clinical Relevance of Surgical Trials – an analysis of planning, reporting and interpretation of surgical trials Available from: https://osf.io/xqs3t/overview. 2025. Accessed March 31, 2026.</w:t>
+      </w:r>
     </w:p>
     <w:p>
       <w:pPr>
@@ -3535,6 +3963,7 @@
           <w:iCs/>
           <w:color w:val="0F4761" w:themeColor="accent1" w:themeShade="BF"/>
           <w:szCs w:val="22"/>
+          <w:bdr w:val="none" w:sz="0" w:space="0" w:color="auto" w:frame="1"/>
         </w:rPr>
       </w:pPr>
       <w:r>
@@ -3556,6 +3985,138 @@
         </w:rPr>
         <w:t>: We thank the reviewer for</w:t>
       </w:r>
+      <w:r>
+        <w:rPr>
+          <w:rFonts w:ascii="Arial" w:hAnsi="Arial" w:cs="Arial"/>
+          <w:i/>
+          <w:iCs/>
+          <w:color w:val="0F4761" w:themeColor="accent1" w:themeShade="BF"/>
+        </w:rPr>
+        <w:t xml:space="preserve"> his suggestive approach to incorporate this important review, highly relevant and with the advantage of being systematic. We incorporated </w:t>
+      </w:r>
+      <w:r>
+        <w:rPr>
+          <w:rFonts w:ascii="Arial" w:eastAsia="Times New Roman" w:hAnsi="Arial" w:cs="Arial"/>
+          <w:i/>
+          <w:iCs/>
+          <w:color w:val="0F4761" w:themeColor="accent1" w:themeShade="BF"/>
+          <w:szCs w:val="22"/>
+          <w:bdr w:val="none" w:sz="0" w:space="0" w:color="auto" w:frame="1"/>
+        </w:rPr>
+        <w:t>in </w:t>
+      </w:r>
+      <w:r>
+        <w:rPr>
+          <w:rFonts w:ascii="Arial" w:eastAsia="Times New Roman" w:hAnsi="Arial" w:cs="Arial"/>
+          <w:b/>
+          <w:bCs/>
+          <w:i/>
+          <w:iCs/>
+          <w:color w:val="0F4761" w:themeColor="accent1" w:themeShade="BF"/>
+          <w:szCs w:val="22"/>
+          <w:bdr w:val="none" w:sz="0" w:space="0" w:color="auto" w:frame="1"/>
+        </w:rPr>
+        <w:t>Discussion</w:t>
+      </w:r>
+      <w:r>
+        <w:rPr>
+          <w:rFonts w:ascii="Arial" w:eastAsia="Times New Roman" w:hAnsi="Arial" w:cs="Arial"/>
+          <w:i/>
+          <w:iCs/>
+          <w:color w:val="0F4761" w:themeColor="accent1" w:themeShade="BF"/>
+          <w:szCs w:val="22"/>
+          <w:bdr w:val="none" w:sz="0" w:space="0" w:color="auto" w:frame="1"/>
+        </w:rPr>
+        <w:t> session</w:t>
+      </w:r>
+      <w:r>
+        <w:rPr>
+          <w:rFonts w:ascii="Arial" w:eastAsia="Times New Roman" w:hAnsi="Arial" w:cs="Arial"/>
+          <w:i/>
+          <w:iCs/>
+          <w:color w:val="0F4761" w:themeColor="accent1" w:themeShade="BF"/>
+          <w:szCs w:val="22"/>
+          <w:bdr w:val="none" w:sz="0" w:space="0" w:color="auto" w:frame="1"/>
+        </w:rPr>
+        <w:t xml:space="preserve"> a paragraph integrating other meta-research studies designed to assess components of studies such as the quality in reporting, risk of bias</w:t>
+      </w:r>
+      <w:r>
+        <w:rPr>
+          <w:rFonts w:ascii="Arial" w:eastAsia="Times New Roman" w:hAnsi="Arial" w:cs="Arial"/>
+          <w:i/>
+          <w:iCs/>
+          <w:color w:val="0F4761" w:themeColor="accent1" w:themeShade="BF"/>
+          <w:szCs w:val="22"/>
+          <w:bdr w:val="none" w:sz="0" w:space="0" w:color="auto" w:frame="1"/>
+        </w:rPr>
+        <w:t>,</w:t>
+      </w:r>
+      <w:r>
+        <w:rPr>
+          <w:rFonts w:ascii="Arial" w:eastAsia="Times New Roman" w:hAnsi="Arial" w:cs="Arial"/>
+          <w:i/>
+          <w:iCs/>
+          <w:color w:val="0F4761" w:themeColor="accent1" w:themeShade="BF"/>
+          <w:szCs w:val="22"/>
+          <w:bdr w:val="none" w:sz="0" w:space="0" w:color="auto" w:frame="1"/>
+        </w:rPr>
+        <w:t>….</w:t>
+      </w:r>
+      <w:r>
+        <w:rPr>
+          <w:rFonts w:ascii="Arial" w:eastAsia="Times New Roman" w:hAnsi="Arial" w:cs="Arial"/>
+          <w:i/>
+          <w:iCs/>
+          <w:color w:val="0F4761" w:themeColor="accent1" w:themeShade="BF"/>
+          <w:szCs w:val="22"/>
+          <w:bdr w:val="none" w:sz="0" w:space="0" w:color="auto" w:frame="1"/>
+        </w:rPr>
+        <w:t xml:space="preserve"> </w:t>
+      </w:r>
+      <w:r>
+        <w:rPr>
+          <w:rFonts w:ascii="Arial" w:eastAsia="Times New Roman" w:hAnsi="Arial" w:cs="Arial"/>
+          <w:i/>
+          <w:iCs/>
+          <w:color w:val="0F4761" w:themeColor="accent1" w:themeShade="BF"/>
+          <w:szCs w:val="22"/>
+          <w:bdr w:val="none" w:sz="0" w:space="0" w:color="auto" w:frame="1"/>
+        </w:rPr>
+        <w:t xml:space="preserve"> We could therefore emphasize how original our approach and the tool we developed were, since we aimed to assess how RCTs could potentially lead to clinical decisions and we therefore used a tool incorporating clinically and practical elements, such as the choice of the hypothesis, of the endpoint assessed, of the relevance in clinical practice of the effect targeted</w:t>
+      </w:r>
+      <w:r>
+        <w:rPr>
+          <w:rFonts w:ascii="Arial" w:eastAsia="Times New Roman" w:hAnsi="Arial" w:cs="Arial"/>
+          <w:i/>
+          <w:iCs/>
+          <w:color w:val="0F4761" w:themeColor="accent1" w:themeShade="BF"/>
+          <w:szCs w:val="22"/>
+          <w:bdr w:val="none" w:sz="0" w:space="0" w:color="auto" w:frame="1"/>
+        </w:rPr>
+        <w:t xml:space="preserve"> </w:t>
+      </w:r>
+      <w:r>
+        <w:rPr>
+          <w:rFonts w:ascii="Arial" w:eastAsia="Times New Roman" w:hAnsi="Arial" w:cs="Arial"/>
+          <w:i/>
+          <w:iCs/>
+          <w:color w:val="0F4761" w:themeColor="accent1" w:themeShade="BF"/>
+          <w:szCs w:val="22"/>
+          <w:bdr w:val="none" w:sz="0" w:space="0" w:color="auto" w:frame="1"/>
+        </w:rPr>
+        <w:t xml:space="preserve">and the </w:t>
+      </w:r>
+      <w:r>
+        <w:rPr>
+          <w:rFonts w:ascii="Arial" w:eastAsia="Times New Roman" w:hAnsi="Arial" w:cs="Arial"/>
+          <w:i/>
+          <w:iCs/>
+          <w:color w:val="0F4761" w:themeColor="accent1" w:themeShade="BF"/>
+          <w:szCs w:val="22"/>
+          <w:bdr w:val="none" w:sz="0" w:space="0" w:color="auto" w:frame="1"/>
+        </w:rPr>
+        <w:t>effect observed at the end of the trial.</w:t>
+      </w:r>
     </w:p>
     <w:p>
       <w:pPr>
@@ -3566,6 +4127,201 @@
           <w:iCs/>
           <w:color w:val="0F4761" w:themeColor="accent1" w:themeShade="BF"/>
           <w:szCs w:val="22"/>
+          <w:bdr w:val="none" w:sz="0" w:space="0" w:color="auto" w:frame="1"/>
+        </w:rPr>
+      </w:pPr>
+    </w:p>
+    <w:p>
+      <w:pPr>
+        <w:textAlignment w:val="baseline"/>
+        <w:rPr>
+          <w:rFonts w:ascii="Arial" w:eastAsia="Times New Roman" w:hAnsi="Arial" w:cs="Arial"/>
+          <w:i/>
+          <w:iCs/>
+          <w:color w:val="0F4761" w:themeColor="accent1" w:themeShade="BF"/>
+          <w:szCs w:val="22"/>
+        </w:rPr>
+      </w:pPr>
+      <w:r>
+        <w:rPr>
+          <w:rFonts w:ascii="Arial" w:eastAsia="Times New Roman" w:hAnsi="Arial" w:cs="Arial"/>
+          <w:i/>
+          <w:iCs/>
+          <w:color w:val="0F4761" w:themeColor="accent1" w:themeShade="BF"/>
+          <w:szCs w:val="22"/>
+        </w:rPr>
+        <w:lastRenderedPageBreak/>
+        <w:t xml:space="preserve">Extracted from </w:t>
+      </w:r>
+      <w:r>
+        <w:rPr>
+          <w:rFonts w:ascii="Arial" w:eastAsia="Times New Roman" w:hAnsi="Arial" w:cs="Arial"/>
+          <w:b/>
+          <w:bCs/>
+          <w:i/>
+          <w:iCs/>
+          <w:color w:val="0F4761" w:themeColor="accent1" w:themeShade="BF"/>
+          <w:szCs w:val="22"/>
+        </w:rPr>
+        <w:t>Discusssion (page)</w:t>
+      </w:r>
+      <w:r>
+        <w:rPr>
+          <w:rFonts w:ascii="Arial" w:eastAsia="Times New Roman" w:hAnsi="Arial" w:cs="Arial"/>
+          <w:i/>
+          <w:iCs/>
+          <w:color w:val="0F4761" w:themeColor="accent1" w:themeShade="BF"/>
+          <w:szCs w:val="22"/>
+        </w:rPr>
+        <w:t>:</w:t>
+      </w:r>
+    </w:p>
+    <w:p>
+      <w:pPr>
+        <w:textAlignment w:val="baseline"/>
+        <w:rPr>
+          <w:rFonts w:ascii="Arial" w:eastAsia="Times New Roman" w:hAnsi="Arial" w:cs="Arial"/>
+          <w:i/>
+          <w:iCs/>
+          <w:color w:val="0F4761" w:themeColor="accent1" w:themeShade="BF"/>
+          <w:szCs w:val="22"/>
+          <w:bdr w:val="none" w:sz="0" w:space="0" w:color="auto" w:frame="1"/>
+        </w:rPr>
+      </w:pPr>
+    </w:p>
+    <w:p>
+      <w:pPr>
+        <w:textAlignment w:val="baseline"/>
+        <w:rPr>
+          <w:rFonts w:ascii="Arial" w:eastAsia="Times New Roman" w:hAnsi="Arial" w:cs="Arial"/>
+          <w:i/>
+          <w:iCs/>
+          <w:color w:val="0F4761" w:themeColor="accent1" w:themeShade="BF"/>
+          <w:szCs w:val="22"/>
+          <w:bdr w:val="none" w:sz="0" w:space="0" w:color="auto" w:frame="1"/>
+        </w:rPr>
+      </w:pPr>
+      <w:r>
+        <w:rPr>
+          <w:rFonts w:ascii="Arial" w:eastAsia="Times New Roman" w:hAnsi="Arial" w:cs="Arial"/>
+          <w:i/>
+          <w:iCs/>
+          <w:color w:val="0F4761" w:themeColor="accent1" w:themeShade="BF"/>
+          <w:szCs w:val="22"/>
+          <w:bdr w:val="none" w:sz="0" w:space="0" w:color="auto" w:frame="1"/>
+        </w:rPr>
+        <w:t>blablbabla</w:t>
+      </w:r>
+    </w:p>
+    <w:p>
+      <w:pPr>
+        <w:textAlignment w:val="baseline"/>
+        <w:rPr>
+          <w:rFonts w:ascii="Arial" w:eastAsia="Times New Roman" w:hAnsi="Arial" w:cs="Arial"/>
+          <w:i/>
+          <w:iCs/>
+          <w:color w:val="0F4761" w:themeColor="accent1" w:themeShade="BF"/>
+          <w:szCs w:val="22"/>
+        </w:rPr>
+      </w:pPr>
+    </w:p>
+    <w:p>
+      <w:pPr>
+        <w:textAlignment w:val="baseline"/>
+        <w:rPr>
+          <w:rFonts w:ascii="Arial" w:eastAsia="Times New Roman" w:hAnsi="Arial" w:cs="Arial"/>
+          <w:color w:val="C82613"/>
+          <w:szCs w:val="22"/>
+        </w:rPr>
+      </w:pPr>
+    </w:p>
+    <w:p>
+      <w:pPr>
+        <w:textAlignment w:val="baseline"/>
+        <w:rPr>
+          <w:rFonts w:ascii="Arial" w:eastAsia="Times New Roman" w:hAnsi="Arial" w:cs="Arial"/>
+          <w:color w:val="000000"/>
+          <w:szCs w:val="22"/>
+        </w:rPr>
+      </w:pPr>
+      <w:r>
+        <w:rPr>
+          <w:rFonts w:ascii="Arial" w:eastAsia="Times New Roman" w:hAnsi="Arial" w:cs="Arial"/>
+          <w:color w:val="000000"/>
+          <w:szCs w:val="22"/>
+        </w:rPr>
+        <w:t>5. Please see my comment #2. The lack of standardized quality assessment is a major limitation of this study. Please elaborate on the decision not to use the current standard method of assessing RCT methodological quality, i.e., Cochrane Risk of Bias 2 (Rob 2) tool, which evaluates randomization, deviations, missing data, measurement, and reporting. If the authors wanted to use their own 4 outcomes assessments, they could have done this for each outcome instead of the composite endpoint, which carries a major risk of bias, please see my previous comments.</w:t>
+      </w:r>
+    </w:p>
+    <w:p>
+      <w:pPr>
+        <w:textAlignment w:val="baseline"/>
+        <w:rPr>
+          <w:rFonts w:ascii="Arial" w:eastAsia="Times New Roman" w:hAnsi="Arial" w:cs="Arial"/>
+          <w:color w:val="000000"/>
+          <w:szCs w:val="22"/>
+        </w:rPr>
+      </w:pPr>
+    </w:p>
+    <w:p>
+      <w:pPr>
+        <w:textAlignment w:val="baseline"/>
+        <w:rPr>
+          <w:rFonts w:ascii="Arial" w:eastAsia="Times New Roman" w:hAnsi="Arial" w:cs="Arial"/>
+          <w:i/>
+          <w:iCs/>
+          <w:color w:val="0F4761" w:themeColor="accent1" w:themeShade="BF"/>
+          <w:szCs w:val="22"/>
+        </w:rPr>
+      </w:pPr>
+      <w:r>
+        <w:rPr>
+          <w:rFonts w:ascii="Arial" w:hAnsi="Arial" w:cs="Arial"/>
+          <w:i/>
+          <w:iCs/>
+          <w:color w:val="0F4761" w:themeColor="accent1" w:themeShade="BF"/>
+          <w:u w:val="single"/>
+        </w:rPr>
+        <w:t>Answer</w:t>
+      </w:r>
+      <w:r>
+        <w:rPr>
+          <w:rFonts w:ascii="Arial" w:hAnsi="Arial" w:cs="Arial"/>
+          <w:i/>
+          <w:iCs/>
+          <w:color w:val="0F4761" w:themeColor="accent1" w:themeShade="BF"/>
+        </w:rPr>
+        <w:t>: We thank the reviewer for</w:t>
+      </w:r>
+      <w:r>
+        <w:rPr>
+          <w:rFonts w:ascii="Arial" w:hAnsi="Arial" w:cs="Arial"/>
+          <w:i/>
+          <w:iCs/>
+          <w:color w:val="0F4761" w:themeColor="accent1" w:themeShade="BF"/>
+        </w:rPr>
+        <w:t xml:space="preserve"> refereng to classical established standard tools such as the Cochrane ROB. The efforts they put into suggesting a change in the design of our study are remarkable and if we had aimed for a systematic review and submitted such a manuscript, we would truly had systematically standardly assessed risk of bias, as well as certainty of evidence and eventually XXX , as recommended. However, as we previously told, our aim was not to assess how much subject to bias the global assessment of the five elements of the four items are. We aimed to develop and refine them before validating their use the approach used for ROB, i.e., in parallel, by two reviewers, and realize a first validation of its feasabil</w:t>
+      </w:r>
+      <w:r>
+        <w:rPr>
+          <w:rFonts w:ascii="Arial" w:hAnsi="Arial" w:cs="Arial"/>
+          <w:i/>
+          <w:iCs/>
+          <w:color w:val="0F4761" w:themeColor="accent1" w:themeShade="BF"/>
+        </w:rPr>
+        <w:t>y based on the proportion which served for its development and powered for precision to assess it in an unbiased unselected sample of contemporary trials in surgery. Our study question was….</w:t>
+      </w:r>
+    </w:p>
+    <w:p>
+      <w:pPr>
+        <w:textAlignment w:val="baseline"/>
+        <w:rPr>
+          <w:rFonts w:ascii="Arial" w:eastAsia="Times New Roman" w:hAnsi="Arial" w:cs="Arial"/>
+          <w:i/>
+          <w:iCs/>
+          <w:color w:val="0F4761" w:themeColor="accent1" w:themeShade="BF"/>
+          <w:szCs w:val="22"/>
+          <w:bdr w:val="none" w:sz="0" w:space="0" w:color="auto" w:frame="1"/>
         </w:rPr>
       </w:pPr>
       <w:r>
@@ -3590,31 +4346,79 @@
           <w:szCs w:val="22"/>
           <w:bdr w:val="none" w:sz="0" w:space="0" w:color="auto" w:frame="1"/>
         </w:rPr>
-        <w:t>As for reviewer #1, we will add one paragraph in </w:t>
-      </w:r>
-      <w:r>
-        <w:rPr>
-          <w:rFonts w:ascii="Arial" w:eastAsia="Times New Roman" w:hAnsi="Arial" w:cs="Arial"/>
-          <w:b/>
-          <w:bCs/>
-          <w:i/>
-          <w:iCs/>
-          <w:color w:val="0F4761" w:themeColor="accent1" w:themeShade="BF"/>
-          <w:szCs w:val="22"/>
-          <w:bdr w:val="none" w:sz="0" w:space="0" w:color="auto" w:frame="1"/>
-        </w:rPr>
-        <w:t>Discussion</w:t>
-      </w:r>
-      <w:r>
-        <w:rPr>
-          <w:rFonts w:ascii="Arial" w:eastAsia="Times New Roman" w:hAnsi="Arial" w:cs="Arial"/>
-          <w:i/>
-          <w:iCs/>
-          <w:color w:val="0F4761" w:themeColor="accent1" w:themeShade="BF"/>
-          <w:szCs w:val="22"/>
-          <w:bdr w:val="none" w:sz="0" w:space="0" w:color="auto" w:frame="1"/>
-        </w:rPr>
-        <w:t> session, where we will compare with other meta-research studies (including systematic reviews) which aimed to either study reporting quality (CONSORT checklist), risk of bias (with ROB) and other markers of study quality. --&gt; agree , again emphasize that we add a entirely new assessment in addition to ROB and quality of reporting</w:t>
+        <w:t>We will add in </w:t>
+      </w:r>
+      <w:r>
+        <w:rPr>
+          <w:rFonts w:ascii="Arial" w:eastAsia="Times New Roman" w:hAnsi="Arial" w:cs="Arial"/>
+          <w:b/>
+          <w:bCs/>
+          <w:i/>
+          <w:iCs/>
+          <w:color w:val="0F4761" w:themeColor="accent1" w:themeShade="BF"/>
+          <w:szCs w:val="22"/>
+          <w:bdr w:val="none" w:sz="0" w:space="0" w:color="auto" w:frame="1"/>
+        </w:rPr>
+        <w:t>Limitations</w:t>
+      </w:r>
+      <w:r>
+        <w:rPr>
+          <w:rFonts w:ascii="Arial" w:eastAsia="Times New Roman" w:hAnsi="Arial" w:cs="Arial"/>
+          <w:i/>
+          <w:iCs/>
+          <w:color w:val="0F4761" w:themeColor="accent1" w:themeShade="BF"/>
+          <w:szCs w:val="22"/>
+          <w:bdr w:val="none" w:sz="0" w:space="0" w:color="auto" w:frame="1"/>
+        </w:rPr>
+        <w:t> section a paragraph, where we will add the limitations of our </w:t>
+      </w:r>
+      <w:r>
+        <w:rPr>
+          <w:rFonts w:ascii="Arial" w:eastAsia="Times New Roman" w:hAnsi="Arial" w:cs="Arial"/>
+          <w:b/>
+          <w:bCs/>
+          <w:i/>
+          <w:iCs/>
+          <w:color w:val="0F4761" w:themeColor="accent1" w:themeShade="BF"/>
+          <w:szCs w:val="22"/>
+          <w:bdr w:val="none" w:sz="0" w:space="0" w:color="auto" w:frame="1"/>
+        </w:rPr>
+        <w:t>NON-systematic</w:t>
+      </w:r>
+      <w:r>
+        <w:rPr>
+          <w:rFonts w:ascii="Arial" w:eastAsia="Times New Roman" w:hAnsi="Arial" w:cs="Arial"/>
+          <w:i/>
+          <w:iCs/>
+          <w:color w:val="0F4761" w:themeColor="accent1" w:themeShade="BF"/>
+          <w:szCs w:val="22"/>
+          <w:bdr w:val="none" w:sz="0" w:space="0" w:color="auto" w:frame="1"/>
+        </w:rPr>
+        <w:t> but </w:t>
+      </w:r>
+      <w:r>
+        <w:rPr>
+          <w:rFonts w:ascii="Arial" w:eastAsia="Times New Roman" w:hAnsi="Arial" w:cs="Arial"/>
+          <w:b/>
+          <w:bCs/>
+          <w:i/>
+          <w:iCs/>
+          <w:color w:val="0F4761" w:themeColor="accent1" w:themeShade="BF"/>
+          <w:szCs w:val="22"/>
+          <w:bdr w:val="none" w:sz="0" w:space="0" w:color="auto" w:frame="1"/>
+        </w:rPr>
+        <w:t>pragmatic </w:t>
+      </w:r>
+      <w:r>
+        <w:rPr>
+          <w:rFonts w:ascii="Arial" w:eastAsia="Times New Roman" w:hAnsi="Arial" w:cs="Arial"/>
+          <w:i/>
+          <w:iCs/>
+          <w:color w:val="0F4761" w:themeColor="accent1" w:themeShade="BF"/>
+          <w:szCs w:val="22"/>
+          <w:bdr w:val="none" w:sz="0" w:space="0" w:color="auto" w:frame="1"/>
+        </w:rPr>
+        <w:t>review, i.e., not systematically all RCTs were analyzed, we did not aim to assess risk of bias, or certainty of evidence (which we would have done for a SR)... We simply did a meta-research study to assess, with a composite outcome which we created (with its limitations), which proportion of RCTs did address some relevant points (clinically relevance of sample size, clinical relevance of results discussion, clear hypothesis and endpoint of interest). </w:t>
       </w:r>
     </w:p>
     <w:p>
@@ -3622,8 +4426,11 @@
         <w:textAlignment w:val="baseline"/>
         <w:rPr>
           <w:rFonts w:ascii="Arial" w:eastAsia="Times New Roman" w:hAnsi="Arial" w:cs="Arial"/>
-          <w:color w:val="C82613"/>
-          <w:szCs w:val="22"/>
+          <w:i/>
+          <w:iCs/>
+          <w:color w:val="0F4761" w:themeColor="accent1" w:themeShade="BF"/>
+          <w:szCs w:val="22"/>
+          <w:bdr w:val="none" w:sz="0" w:space="0" w:color="auto" w:frame="1"/>
         </w:rPr>
       </w:pPr>
     </w:p>
@@ -3632,166 +4439,22 @@
         <w:textAlignment w:val="baseline"/>
         <w:rPr>
           <w:rFonts w:ascii="Arial" w:eastAsia="Times New Roman" w:hAnsi="Arial" w:cs="Arial"/>
-          <w:color w:val="000000"/>
-          <w:szCs w:val="22"/>
-        </w:rPr>
-      </w:pPr>
-      <w:r>
-        <w:rPr>
-          <w:rFonts w:ascii="Arial" w:eastAsia="Times New Roman" w:hAnsi="Arial" w:cs="Arial"/>
-          <w:color w:val="000000"/>
-          <w:szCs w:val="22"/>
-        </w:rPr>
-        <w:t>5. Please see my comment #2. The lack of standardized quality assessment is a major limitation of this study. Please elaborate on the decision not to use the current standard method of assessing RCT methodological quality, i.e., Cochrane Risk of Bias 2 (Rob 2) tool, which evaluates randomization, deviations, missing data, measurement, and reporting. If the authors wanted to use their own 4 outcomes assessments, they could have done this for each outcome instead of the composite endpoint, which carries a major risk of bias, please see my previous comments.</w:t>
-      </w:r>
-    </w:p>
-    <w:p>
-      <w:pPr>
-        <w:textAlignment w:val="baseline"/>
-        <w:rPr>
-          <w:rFonts w:ascii="Arial" w:eastAsia="Times New Roman" w:hAnsi="Arial" w:cs="Arial"/>
-          <w:color w:val="000000"/>
-          <w:szCs w:val="22"/>
-        </w:rPr>
-      </w:pPr>
-    </w:p>
-    <w:p>
-      <w:pPr>
-        <w:textAlignment w:val="baseline"/>
-        <w:rPr>
-          <w:rFonts w:ascii="Arial" w:eastAsia="Times New Roman" w:hAnsi="Arial" w:cs="Arial"/>
-          <w:i/>
-          <w:iCs/>
-          <w:color w:val="0F4761" w:themeColor="accent1" w:themeShade="BF"/>
-          <w:szCs w:val="22"/>
-        </w:rPr>
-      </w:pPr>
-      <w:r>
-        <w:rPr>
-          <w:rFonts w:ascii="Arial" w:hAnsi="Arial" w:cs="Arial"/>
-          <w:i/>
-          <w:iCs/>
-          <w:color w:val="0F4761" w:themeColor="accent1" w:themeShade="BF"/>
-          <w:u w:val="single"/>
-        </w:rPr>
-        <w:t>Answer</w:t>
-      </w:r>
-      <w:r>
-        <w:rPr>
-          <w:rFonts w:ascii="Arial" w:hAnsi="Arial" w:cs="Arial"/>
-          <w:i/>
-          <w:iCs/>
-          <w:color w:val="0F4761" w:themeColor="accent1" w:themeShade="BF"/>
-        </w:rPr>
-        <w:t>: We thank the reviewer for</w:t>
-      </w:r>
-    </w:p>
-    <w:p>
-      <w:pPr>
-        <w:textAlignment w:val="baseline"/>
-        <w:rPr>
-          <w:rFonts w:ascii="Arial" w:eastAsia="Times New Roman" w:hAnsi="Arial" w:cs="Arial"/>
-          <w:i/>
-          <w:iCs/>
-          <w:color w:val="0F4761" w:themeColor="accent1" w:themeShade="BF"/>
-          <w:szCs w:val="22"/>
-        </w:rPr>
-      </w:pPr>
-      <w:r>
-        <w:rPr>
-          <w:rFonts w:ascii="Arial" w:eastAsia="Times New Roman" w:hAnsi="Arial" w:cs="Arial"/>
-          <w:b/>
-          <w:bCs/>
-          <w:i/>
-          <w:iCs/>
-          <w:color w:val="0F4761" w:themeColor="accent1" w:themeShade="BF"/>
-          <w:szCs w:val="22"/>
-          <w:bdr w:val="none" w:sz="0" w:space="0" w:color="auto" w:frame="1"/>
-        </w:rPr>
-        <w:t>Revisions to adopt: </w:t>
-      </w:r>
-      <w:r>
-        <w:rPr>
-          <w:rFonts w:ascii="Arial" w:eastAsia="Times New Roman" w:hAnsi="Arial" w:cs="Arial"/>
-          <w:i/>
-          <w:iCs/>
-          <w:color w:val="0F4761" w:themeColor="accent1" w:themeShade="BF"/>
-          <w:szCs w:val="22"/>
-          <w:bdr w:val="none" w:sz="0" w:space="0" w:color="auto" w:frame="1"/>
-        </w:rPr>
-        <w:t>We will add in </w:t>
-      </w:r>
-      <w:r>
-        <w:rPr>
-          <w:rFonts w:ascii="Arial" w:eastAsia="Times New Roman" w:hAnsi="Arial" w:cs="Arial"/>
-          <w:b/>
-          <w:bCs/>
-          <w:i/>
-          <w:iCs/>
-          <w:color w:val="0F4761" w:themeColor="accent1" w:themeShade="BF"/>
-          <w:szCs w:val="22"/>
-          <w:bdr w:val="none" w:sz="0" w:space="0" w:color="auto" w:frame="1"/>
-        </w:rPr>
-        <w:t>Limitations</w:t>
-      </w:r>
-      <w:r>
-        <w:rPr>
-          <w:rFonts w:ascii="Arial" w:eastAsia="Times New Roman" w:hAnsi="Arial" w:cs="Arial"/>
-          <w:i/>
-          <w:iCs/>
-          <w:color w:val="0F4761" w:themeColor="accent1" w:themeShade="BF"/>
-          <w:szCs w:val="22"/>
-          <w:bdr w:val="none" w:sz="0" w:space="0" w:color="auto" w:frame="1"/>
-        </w:rPr>
-        <w:t> section a paragraph, where we will add the limitations of our </w:t>
-      </w:r>
-      <w:r>
-        <w:rPr>
-          <w:rFonts w:ascii="Arial" w:eastAsia="Times New Roman" w:hAnsi="Arial" w:cs="Arial"/>
-          <w:b/>
-          <w:bCs/>
-          <w:i/>
-          <w:iCs/>
-          <w:color w:val="0F4761" w:themeColor="accent1" w:themeShade="BF"/>
-          <w:szCs w:val="22"/>
-          <w:bdr w:val="none" w:sz="0" w:space="0" w:color="auto" w:frame="1"/>
-        </w:rPr>
-        <w:t>NON-systematic</w:t>
-      </w:r>
-      <w:r>
-        <w:rPr>
-          <w:rFonts w:ascii="Arial" w:eastAsia="Times New Roman" w:hAnsi="Arial" w:cs="Arial"/>
-          <w:i/>
-          <w:iCs/>
-          <w:color w:val="0F4761" w:themeColor="accent1" w:themeShade="BF"/>
-          <w:szCs w:val="22"/>
-          <w:bdr w:val="none" w:sz="0" w:space="0" w:color="auto" w:frame="1"/>
-        </w:rPr>
-        <w:t> but </w:t>
-      </w:r>
-      <w:r>
-        <w:rPr>
-          <w:rFonts w:ascii="Arial" w:eastAsia="Times New Roman" w:hAnsi="Arial" w:cs="Arial"/>
-          <w:b/>
-          <w:bCs/>
-          <w:i/>
-          <w:iCs/>
-          <w:color w:val="0F4761" w:themeColor="accent1" w:themeShade="BF"/>
-          <w:szCs w:val="22"/>
-          <w:bdr w:val="none" w:sz="0" w:space="0" w:color="auto" w:frame="1"/>
-        </w:rPr>
-        <w:t>pragmatic </w:t>
-      </w:r>
-      <w:r>
-        <w:rPr>
-          <w:rFonts w:ascii="Arial" w:eastAsia="Times New Roman" w:hAnsi="Arial" w:cs="Arial"/>
-          <w:i/>
-          <w:iCs/>
-          <w:color w:val="0F4761" w:themeColor="accent1" w:themeShade="BF"/>
-          <w:szCs w:val="22"/>
-          <w:bdr w:val="none" w:sz="0" w:space="0" w:color="auto" w:frame="1"/>
-        </w:rPr>
-        <w:t>review, i.e., not systematically all RCTs were analyzed, we did not aim to assess risk of bias, or certainty of evidence (which we would have done for a SR)... We simply did a meta-research study to assess, with a composite outcome which we created (with its limitations), which proportion of RCTs did address some relevant points (clinically relevance of sample size, clinical relevance of results discussion, clear hypothesis and endpoint of interest). --&gt; agree I would not refer to a non systematic review, I always argued that we should call it a survey of the literature since I feared that we would end up in such discussion. all the studies on quality of reporting and risk of bias over the years were surveys and not systematic reivews. survey are not worse but the appropriate study design for this study question</w:t>
+          <w:i/>
+          <w:iCs/>
+          <w:color w:val="0F4761" w:themeColor="accent1" w:themeShade="BF"/>
+          <w:szCs w:val="22"/>
+        </w:rPr>
+      </w:pPr>
+      <w:r>
+        <w:rPr>
+          <w:rFonts w:ascii="Arial" w:eastAsia="Times New Roman" w:hAnsi="Arial" w:cs="Arial"/>
+          <w:i/>
+          <w:iCs/>
+          <w:color w:val="0F4761" w:themeColor="accent1" w:themeShade="BF"/>
+          <w:szCs w:val="22"/>
+          <w:bdr w:val="none" w:sz="0" w:space="0" w:color="auto" w:frame="1"/>
+        </w:rPr>
+        <w:t>--&gt; agree I would not refer to a non systematic review, I always argued that we should call it a survey of the literature since I feared that we would end up in such discussion. all the studies on quality of reporting and risk of bias over the years were surveys and not systematic reivews. survey are not worse but the appropriate study design for this study question</w:t>
       </w:r>
     </w:p>
     <w:p>

</xml_diff>